<commit_message>
table of contents fixed
</commit_message>
<xml_diff>
--- a/Dokumentáció/Fejlesztoi_dokumentacio.docx
+++ b/Dokumentáció/Fejlesztoi_dokumentacio.docx
@@ -26,7 +26,7 @@
       <w:pPr>
         <w:pStyle w:val="Cmsor1"/>
       </w:pPr>
-      <w:bookmarkStart w:id="0" w:name="_Toc224555625"/>
+      <w:bookmarkStart w:id="0" w:name="_Toc227744993"/>
       <w:r>
         <w:t>Tartalomjegyzék</w:t>
       </w:r>
@@ -110,7 +110,7 @@
         <w:rPr>
           <w:noProof/>
         </w:rPr>
-        <w:instrText xml:space="preserve"> PAGEREF _Toc224555625 \h </w:instrText>
+        <w:instrText xml:space="preserve"> PAGEREF _Toc227744993 \h </w:instrText>
       </w:r>
       <w:r>
         <w:rPr>
@@ -187,7 +187,7 @@
         <w:rPr>
           <w:noProof/>
         </w:rPr>
-        <w:instrText xml:space="preserve"> PAGEREF _Toc224555626 \h </w:instrText>
+        <w:instrText xml:space="preserve"> PAGEREF _Toc227744994 \h </w:instrText>
       </w:r>
       <w:r>
         <w:rPr>
@@ -264,7 +264,7 @@
         <w:rPr>
           <w:noProof/>
         </w:rPr>
-        <w:instrText xml:space="preserve"> PAGEREF _Toc224555627 \h </w:instrText>
+        <w:instrText xml:space="preserve"> PAGEREF _Toc227744995 \h </w:instrText>
       </w:r>
       <w:r>
         <w:rPr>
@@ -341,7 +341,7 @@
         <w:rPr>
           <w:noProof/>
         </w:rPr>
-        <w:instrText xml:space="preserve"> PAGEREF _Toc224555628 \h </w:instrText>
+        <w:instrText xml:space="preserve"> PAGEREF _Toc227744996 \h </w:instrText>
       </w:r>
       <w:r>
         <w:rPr>
@@ -418,7 +418,7 @@
         <w:rPr>
           <w:noProof/>
         </w:rPr>
-        <w:instrText xml:space="preserve"> PAGEREF _Toc224555629 \h </w:instrText>
+        <w:instrText xml:space="preserve"> PAGEREF _Toc227744997 \h </w:instrText>
       </w:r>
       <w:r>
         <w:rPr>
@@ -495,7 +495,7 @@
         <w:rPr>
           <w:noProof/>
         </w:rPr>
-        <w:instrText xml:space="preserve"> PAGEREF _Toc224555630 \h </w:instrText>
+        <w:instrText xml:space="preserve"> PAGEREF _Toc227744998 \h </w:instrText>
       </w:r>
       <w:r>
         <w:rPr>
@@ -572,7 +572,7 @@
         <w:rPr>
           <w:noProof/>
         </w:rPr>
-        <w:instrText xml:space="preserve"> PAGEREF _Toc224555631 \h </w:instrText>
+        <w:instrText xml:space="preserve"> PAGEREF _Toc227744999 \h </w:instrText>
       </w:r>
       <w:r>
         <w:rPr>
@@ -649,7 +649,7 @@
         <w:rPr>
           <w:noProof/>
         </w:rPr>
-        <w:instrText xml:space="preserve"> PAGEREF _Toc224555632 \h </w:instrText>
+        <w:instrText xml:space="preserve"> PAGEREF _Toc227745000 \h </w:instrText>
       </w:r>
       <w:r>
         <w:rPr>
@@ -726,7 +726,7 @@
         <w:rPr>
           <w:noProof/>
         </w:rPr>
-        <w:instrText xml:space="preserve"> PAGEREF _Toc224555633 \h </w:instrText>
+        <w:instrText xml:space="preserve"> PAGEREF _Toc227745001 \h </w:instrText>
       </w:r>
       <w:r>
         <w:rPr>
@@ -803,7 +803,7 @@
         <w:rPr>
           <w:noProof/>
         </w:rPr>
-        <w:instrText xml:space="preserve"> PAGEREF _Toc224555634 \h </w:instrText>
+        <w:instrText xml:space="preserve"> PAGEREF _Toc227745002 \h </w:instrText>
       </w:r>
       <w:r>
         <w:rPr>
@@ -880,7 +880,7 @@
         <w:rPr>
           <w:noProof/>
         </w:rPr>
-        <w:instrText xml:space="preserve"> PAGEREF _Toc224555635 \h </w:instrText>
+        <w:instrText xml:space="preserve"> PAGEREF _Toc227745003 \h </w:instrText>
       </w:r>
       <w:r>
         <w:rPr>
@@ -957,7 +957,7 @@
         <w:rPr>
           <w:noProof/>
         </w:rPr>
-        <w:instrText xml:space="preserve"> PAGEREF _Toc224555636 \h </w:instrText>
+        <w:instrText xml:space="preserve"> PAGEREF _Toc227745004 \h </w:instrText>
       </w:r>
       <w:r>
         <w:rPr>
@@ -1034,7 +1034,7 @@
         <w:rPr>
           <w:noProof/>
         </w:rPr>
-        <w:instrText xml:space="preserve"> PAGEREF _Toc224555637 \h </w:instrText>
+        <w:instrText xml:space="preserve"> PAGEREF _Toc227745005 \h </w:instrText>
       </w:r>
       <w:r>
         <w:rPr>
@@ -1111,7 +1111,7 @@
         <w:rPr>
           <w:noProof/>
         </w:rPr>
-        <w:instrText xml:space="preserve"> PAGEREF _Toc224555638 \h </w:instrText>
+        <w:instrText xml:space="preserve"> PAGEREF _Toc227745006 \h </w:instrText>
       </w:r>
       <w:r>
         <w:rPr>
@@ -1188,7 +1188,7 @@
         <w:rPr>
           <w:noProof/>
         </w:rPr>
-        <w:instrText xml:space="preserve"> PAGEREF _Toc224555639 \h </w:instrText>
+        <w:instrText xml:space="preserve"> PAGEREF _Toc227745007 \h </w:instrText>
       </w:r>
       <w:r>
         <w:rPr>
@@ -1265,7 +1265,7 @@
         <w:rPr>
           <w:noProof/>
         </w:rPr>
-        <w:instrText xml:space="preserve"> PAGEREF _Toc224555640 \h </w:instrText>
+        <w:instrText xml:space="preserve"> PAGEREF _Toc227745008 \h </w:instrText>
       </w:r>
       <w:r>
         <w:rPr>
@@ -1342,7 +1342,7 @@
         <w:rPr>
           <w:noProof/>
         </w:rPr>
-        <w:instrText xml:space="preserve"> PAGEREF _Toc224555641 \h </w:instrText>
+        <w:instrText xml:space="preserve"> PAGEREF _Toc227745009 \h </w:instrText>
       </w:r>
       <w:r>
         <w:rPr>
@@ -1419,7 +1419,7 @@
         <w:rPr>
           <w:noProof/>
         </w:rPr>
-        <w:instrText xml:space="preserve"> PAGEREF _Toc224555642 \h </w:instrText>
+        <w:instrText xml:space="preserve"> PAGEREF _Toc227745010 \h </w:instrText>
       </w:r>
       <w:r>
         <w:rPr>
@@ -1496,7 +1496,7 @@
         <w:rPr>
           <w:noProof/>
         </w:rPr>
-        <w:instrText xml:space="preserve"> PAGEREF _Toc224555643 \h </w:instrText>
+        <w:instrText xml:space="preserve"> PAGEREF _Toc227745011 \h </w:instrText>
       </w:r>
       <w:r>
         <w:rPr>
@@ -1573,7 +1573,7 @@
         <w:rPr>
           <w:noProof/>
         </w:rPr>
-        <w:instrText xml:space="preserve"> PAGEREF _Toc224555644 \h </w:instrText>
+        <w:instrText xml:space="preserve"> PAGEREF _Toc227745012 \h </w:instrText>
       </w:r>
       <w:r>
         <w:rPr>
@@ -1650,7 +1650,7 @@
         <w:rPr>
           <w:noProof/>
         </w:rPr>
-        <w:instrText xml:space="preserve"> PAGEREF _Toc224555645 \h </w:instrText>
+        <w:instrText xml:space="preserve"> PAGEREF _Toc227745013 \h </w:instrText>
       </w:r>
       <w:r>
         <w:rPr>
@@ -1727,7 +1727,7 @@
         <w:rPr>
           <w:noProof/>
         </w:rPr>
-        <w:instrText xml:space="preserve"> PAGEREF _Toc224555646 \h </w:instrText>
+        <w:instrText xml:space="preserve"> PAGEREF _Toc227745014 \h </w:instrText>
       </w:r>
       <w:r>
         <w:rPr>
@@ -1804,7 +1804,7 @@
         <w:rPr>
           <w:noProof/>
         </w:rPr>
-        <w:instrText xml:space="preserve"> PAGEREF _Toc224555647 \h </w:instrText>
+        <w:instrText xml:space="preserve"> PAGEREF _Toc227745015 \h </w:instrText>
       </w:r>
       <w:r>
         <w:rPr>
@@ -1881,7 +1881,7 @@
         <w:rPr>
           <w:noProof/>
         </w:rPr>
-        <w:instrText xml:space="preserve"> PAGEREF _Toc224555648 \h </w:instrText>
+        <w:instrText xml:space="preserve"> PAGEREF _Toc227745016 \h </w:instrText>
       </w:r>
       <w:r>
         <w:rPr>
@@ -1959,7 +1959,7 @@
         <w:rPr>
           <w:noProof/>
         </w:rPr>
-        <w:instrText xml:space="preserve"> PAGEREF _Toc224555649 \h </w:instrText>
+        <w:instrText xml:space="preserve"> PAGEREF _Toc227745017 \h </w:instrText>
       </w:r>
       <w:r>
         <w:rPr>
@@ -2036,7 +2036,7 @@
         <w:rPr>
           <w:noProof/>
         </w:rPr>
-        <w:instrText xml:space="preserve"> PAGEREF _Toc224555650 \h </w:instrText>
+        <w:instrText xml:space="preserve"> PAGEREF _Toc227745018 \h </w:instrText>
       </w:r>
       <w:r>
         <w:rPr>
@@ -2054,61 +2054,6 @@
           <w:noProof/>
         </w:rPr>
         <w:t>12</w:t>
-      </w:r>
-      <w:r>
-        <w:rPr>
-          <w:noProof/>
-        </w:rPr>
-        <w:fldChar w:fldCharType="end"/>
-      </w:r>
-    </w:p>
-    <w:p>
-      <w:pPr>
-        <w:pStyle w:val="TJ2"/>
-        <w:tabs>
-          <w:tab w:val="right" w:leader="dot" w:pos="8777"/>
-        </w:tabs>
-        <w:rPr>
-          <w:rFonts w:asciiTheme="minorHAnsi" w:eastAsiaTheme="minorEastAsia" w:hAnsiTheme="minorHAnsi"/>
-          <w:noProof/>
-          <w:sz w:val="22"/>
-          <w:lang w:eastAsia="hu-HU"/>
-        </w:rPr>
-      </w:pPr>
-      <w:r>
-        <w:rPr>
-          <w:noProof/>
-        </w:rPr>
-        <w:tab/>
-      </w:r>
-      <w:r>
-        <w:rPr>
-          <w:noProof/>
-        </w:rPr>
-        <w:fldChar w:fldCharType="begin"/>
-      </w:r>
-      <w:r>
-        <w:rPr>
-          <w:noProof/>
-        </w:rPr>
-        <w:instrText xml:space="preserve"> PAGEREF _Toc224555651 \h </w:instrText>
-      </w:r>
-      <w:r>
-        <w:rPr>
-          <w:noProof/>
-        </w:rPr>
-      </w:r>
-      <w:r>
-        <w:rPr>
-          <w:noProof/>
-        </w:rPr>
-        <w:fldChar w:fldCharType="separate"/>
-      </w:r>
-      <w:r>
-        <w:rPr>
-          <w:noProof/>
-        </w:rPr>
-        <w:t>13</w:t>
       </w:r>
       <w:r>
         <w:rPr>
@@ -2168,7 +2113,7 @@
         <w:rPr>
           <w:noProof/>
         </w:rPr>
-        <w:instrText xml:space="preserve"> PAGEREF _Toc224555652 \h </w:instrText>
+        <w:instrText xml:space="preserve"> PAGEREF _Toc227745020 \h </w:instrText>
       </w:r>
       <w:r>
         <w:rPr>
@@ -2186,171 +2131,6 @@
           <w:noProof/>
         </w:rPr>
         <w:t>13</w:t>
-      </w:r>
-      <w:r>
-        <w:rPr>
-          <w:noProof/>
-        </w:rPr>
-        <w:fldChar w:fldCharType="end"/>
-      </w:r>
-    </w:p>
-    <w:p>
-      <w:pPr>
-        <w:pStyle w:val="TJ1"/>
-        <w:tabs>
-          <w:tab w:val="right" w:leader="dot" w:pos="8777"/>
-        </w:tabs>
-        <w:rPr>
-          <w:rFonts w:asciiTheme="minorHAnsi" w:eastAsiaTheme="minorEastAsia" w:hAnsiTheme="minorHAnsi"/>
-          <w:noProof/>
-          <w:sz w:val="22"/>
-          <w:lang w:eastAsia="hu-HU"/>
-        </w:rPr>
-      </w:pPr>
-      <w:r>
-        <w:rPr>
-          <w:noProof/>
-        </w:rPr>
-        <w:tab/>
-      </w:r>
-      <w:r>
-        <w:rPr>
-          <w:noProof/>
-        </w:rPr>
-        <w:fldChar w:fldCharType="begin"/>
-      </w:r>
-      <w:r>
-        <w:rPr>
-          <w:noProof/>
-        </w:rPr>
-        <w:instrText xml:space="preserve"> PAGEREF _Toc224555653 \h </w:instrText>
-      </w:r>
-      <w:r>
-        <w:rPr>
-          <w:noProof/>
-        </w:rPr>
-      </w:r>
-      <w:r>
-        <w:rPr>
-          <w:noProof/>
-        </w:rPr>
-        <w:fldChar w:fldCharType="separate"/>
-      </w:r>
-      <w:r>
-        <w:rPr>
-          <w:noProof/>
-        </w:rPr>
-        <w:t>14</w:t>
-      </w:r>
-      <w:r>
-        <w:rPr>
-          <w:noProof/>
-        </w:rPr>
-        <w:fldChar w:fldCharType="end"/>
-      </w:r>
-    </w:p>
-    <w:p>
-      <w:pPr>
-        <w:pStyle w:val="TJ1"/>
-        <w:tabs>
-          <w:tab w:val="right" w:leader="dot" w:pos="8777"/>
-        </w:tabs>
-        <w:rPr>
-          <w:rFonts w:asciiTheme="minorHAnsi" w:eastAsiaTheme="minorEastAsia" w:hAnsiTheme="minorHAnsi"/>
-          <w:noProof/>
-          <w:sz w:val="22"/>
-          <w:lang w:eastAsia="hu-HU"/>
-        </w:rPr>
-      </w:pPr>
-      <w:r>
-        <w:rPr>
-          <w:noProof/>
-        </w:rPr>
-        <w:tab/>
-      </w:r>
-      <w:r>
-        <w:rPr>
-          <w:noProof/>
-        </w:rPr>
-        <w:fldChar w:fldCharType="begin"/>
-      </w:r>
-      <w:r>
-        <w:rPr>
-          <w:noProof/>
-        </w:rPr>
-        <w:instrText xml:space="preserve"> PAGEREF _Toc224555654 \h </w:instrText>
-      </w:r>
-      <w:r>
-        <w:rPr>
-          <w:noProof/>
-        </w:rPr>
-      </w:r>
-      <w:r>
-        <w:rPr>
-          <w:noProof/>
-        </w:rPr>
-        <w:fldChar w:fldCharType="separate"/>
-      </w:r>
-      <w:r>
-        <w:rPr>
-          <w:noProof/>
-        </w:rPr>
-        <w:t>14</w:t>
-      </w:r>
-      <w:r>
-        <w:rPr>
-          <w:noProof/>
-        </w:rPr>
-        <w:fldChar w:fldCharType="end"/>
-      </w:r>
-    </w:p>
-    <w:p>
-      <w:pPr>
-        <w:pStyle w:val="TJ1"/>
-        <w:tabs>
-          <w:tab w:val="right" w:leader="dot" w:pos="8777"/>
-        </w:tabs>
-        <w:rPr>
-          <w:rFonts w:asciiTheme="minorHAnsi" w:eastAsiaTheme="minorEastAsia" w:hAnsiTheme="minorHAnsi"/>
-          <w:noProof/>
-          <w:sz w:val="22"/>
-          <w:lang w:eastAsia="hu-HU"/>
-        </w:rPr>
-      </w:pPr>
-      <w:r>
-        <w:rPr>
-          <w:noProof/>
-        </w:rPr>
-        <w:tab/>
-      </w:r>
-      <w:r>
-        <w:rPr>
-          <w:noProof/>
-        </w:rPr>
-        <w:fldChar w:fldCharType="begin"/>
-      </w:r>
-      <w:r>
-        <w:rPr>
-          <w:noProof/>
-        </w:rPr>
-        <w:instrText xml:space="preserve"> PAGEREF _Toc224555655 \h </w:instrText>
-      </w:r>
-      <w:r>
-        <w:rPr>
-          <w:noProof/>
-        </w:rPr>
-      </w:r>
-      <w:r>
-        <w:rPr>
-          <w:noProof/>
-        </w:rPr>
-        <w:fldChar w:fldCharType="separate"/>
-      </w:r>
-      <w:r>
-        <w:rPr>
-          <w:noProof/>
-        </w:rPr>
-        <w:t>15</w:t>
       </w:r>
       <w:r>
         <w:rPr>
@@ -2410,7 +2190,7 @@
         <w:rPr>
           <w:noProof/>
         </w:rPr>
-        <w:instrText xml:space="preserve"> PAGEREF _Toc224555656 \h </w:instrText>
+        <w:instrText xml:space="preserve"> PAGEREF _Toc227745024 \h </w:instrText>
       </w:r>
       <w:r>
         <w:rPr>
@@ -2487,7 +2267,7 @@
         <w:rPr>
           <w:noProof/>
         </w:rPr>
-        <w:instrText xml:space="preserve"> PAGEREF _Toc224555657 \h </w:instrText>
+        <w:instrText xml:space="preserve"> PAGEREF _Toc227745025 \h </w:instrText>
       </w:r>
       <w:r>
         <w:rPr>
@@ -2564,7 +2344,7 @@
         <w:rPr>
           <w:noProof/>
         </w:rPr>
-        <w:instrText xml:space="preserve"> PAGEREF _Toc224555658 \h </w:instrText>
+        <w:instrText xml:space="preserve"> PAGEREF _Toc227745026 \h </w:instrText>
       </w:r>
       <w:r>
         <w:rPr>
@@ -2641,7 +2421,7 @@
         <w:rPr>
           <w:noProof/>
         </w:rPr>
-        <w:instrText xml:space="preserve"> PAGEREF _Toc224555659 \h </w:instrText>
+        <w:instrText xml:space="preserve"> PAGEREF _Toc227745027 \h </w:instrText>
       </w:r>
       <w:r>
         <w:rPr>
@@ -2718,7 +2498,7 @@
         <w:rPr>
           <w:noProof/>
         </w:rPr>
-        <w:instrText xml:space="preserve"> PAGEREF _Toc224555660 \h </w:instrText>
+        <w:instrText xml:space="preserve"> PAGEREF _Toc227745028 \h </w:instrText>
       </w:r>
       <w:r>
         <w:rPr>
@@ -2790,7 +2570,7 @@
       <w:pPr>
         <w:pStyle w:val="Cmsor1"/>
       </w:pPr>
-      <w:bookmarkStart w:id="1" w:name="_Toc224555626"/>
+      <w:bookmarkStart w:id="1" w:name="_Toc227744994"/>
       <w:r>
         <w:lastRenderedPageBreak/>
         <w:t>A projekt célja és megvalósítása</w:t>
@@ -2801,7 +2581,7 @@
       <w:pPr>
         <w:pStyle w:val="Cmsor2"/>
       </w:pPr>
-      <w:bookmarkStart w:id="2" w:name="_Toc224555627"/>
+      <w:bookmarkStart w:id="2" w:name="_Toc227744995"/>
       <w:r>
         <w:t>Miért ezt választottuk?</w:t>
       </w:r>
@@ -2876,7 +2656,7 @@
       <w:pPr>
         <w:pStyle w:val="Cmsor2"/>
       </w:pPr>
-      <w:bookmarkStart w:id="3" w:name="_Toc224555628"/>
+      <w:bookmarkStart w:id="3" w:name="_Toc227744996"/>
       <w:r>
         <w:t>Mi a célunk?</w:t>
       </w:r>
@@ -2988,7 +2768,7 @@
       <w:pPr>
         <w:pStyle w:val="Cmsor2"/>
       </w:pPr>
-      <w:bookmarkStart w:id="4" w:name="_Toc224555629"/>
+      <w:bookmarkStart w:id="4" w:name="_Toc227744997"/>
       <w:r>
         <w:t>Munkamegosztás</w:t>
       </w:r>
@@ -3438,7 +3218,7 @@
       <w:pPr>
         <w:pStyle w:val="Cmsor1"/>
       </w:pPr>
-      <w:bookmarkStart w:id="5" w:name="_Toc224555630"/>
+      <w:bookmarkStart w:id="5" w:name="_Toc227744998"/>
       <w:r>
         <w:lastRenderedPageBreak/>
         <w:t>Követelmények</w:t>
@@ -3449,7 +3229,7 @@
       <w:pPr>
         <w:pStyle w:val="Cmsor2"/>
       </w:pPr>
-      <w:bookmarkStart w:id="6" w:name="_Toc224555631"/>
+      <w:bookmarkStart w:id="6" w:name="_Toc227744999"/>
       <w:r>
         <w:t>Funkcionális követelmények</w:t>
       </w:r>
@@ -3525,11 +3305,19 @@
         <w:ind w:firstLine="0"/>
       </w:pPr>
       <w:r>
-        <w:t>Más böngészőkben — például Firefoxban vagy Safari</w:t>
+        <w:t xml:space="preserve">Más böngészőkben — például Firefoxban vagy </w:t>
+      </w:r>
+      <w:proofErr w:type="spellStart"/>
+      <w:r>
+        <w:t>Safari</w:t>
       </w:r>
       <w:r>
         <w:softHyphen/>
-        <w:t xml:space="preserve">ban — előfordulhat, hogy bizonyos funkciók </w:t>
+        <w:t>ban</w:t>
+      </w:r>
+      <w:proofErr w:type="spellEnd"/>
+      <w:r>
+        <w:t xml:space="preserve"> — előfordulhat, hogy bizonyos funkciók </w:t>
       </w:r>
       <w:r>
         <w:rPr>
@@ -3576,7 +3364,7 @@
       <w:pPr>
         <w:pStyle w:val="Cmsor1"/>
       </w:pPr>
-      <w:bookmarkStart w:id="7" w:name="_Toc224555632"/>
+      <w:bookmarkStart w:id="7" w:name="_Toc227745000"/>
       <w:r>
         <w:lastRenderedPageBreak/>
         <w:t>A projektben használt webfejlesztési technológiák</w:t>
@@ -3625,7 +3413,7 @@
       <w:pPr>
         <w:pStyle w:val="Cmsor2"/>
       </w:pPr>
-      <w:bookmarkStart w:id="8" w:name="_Toc224555633"/>
+      <w:bookmarkStart w:id="8" w:name="_Toc227745001"/>
       <w:r>
         <w:t>Fejlesztői környezetek</w:t>
       </w:r>
@@ -3635,7 +3423,7 @@
       <w:pPr>
         <w:pStyle w:val="Cmsor3"/>
       </w:pPr>
-      <w:bookmarkStart w:id="9" w:name="_Toc224555634"/>
+      <w:bookmarkStart w:id="9" w:name="_Toc227745002"/>
       <w:r>
         <w:t>Visual Studio Code</w:t>
       </w:r>
@@ -3745,7 +3533,7 @@
       <w:pPr>
         <w:pStyle w:val="Cmsor3"/>
       </w:pPr>
-      <w:bookmarkStart w:id="10" w:name="_Toc224555635"/>
+      <w:bookmarkStart w:id="10" w:name="_Toc227745003"/>
       <w:r>
         <w:t>Visual Studio</w:t>
       </w:r>
@@ -3854,7 +3642,7 @@
       <w:pPr>
         <w:pStyle w:val="Cmsor2"/>
       </w:pPr>
-      <w:bookmarkStart w:id="11" w:name="_Toc224555636"/>
+      <w:bookmarkStart w:id="11" w:name="_Toc227745004"/>
       <w:r>
         <w:t>Programozási nyelvek</w:t>
       </w:r>
@@ -3864,7 +3652,7 @@
       <w:pPr>
         <w:pStyle w:val="Cmsor3"/>
       </w:pPr>
-      <w:bookmarkStart w:id="12" w:name="_Toc224555637"/>
+      <w:bookmarkStart w:id="12" w:name="_Toc227745005"/>
       <w:r>
         <w:t>HTML</w:t>
       </w:r>
@@ -3972,7 +3760,7 @@
       <w:pPr>
         <w:pStyle w:val="Cmsor3"/>
       </w:pPr>
-      <w:bookmarkStart w:id="13" w:name="_Toc224555638"/>
+      <w:bookmarkStart w:id="13" w:name="_Toc227745006"/>
       <w:r>
         <w:rPr>
           <w:noProof/>
@@ -4095,7 +3883,7 @@
       <w:pPr>
         <w:pStyle w:val="Cmsor3"/>
       </w:pPr>
-      <w:bookmarkStart w:id="14" w:name="_Toc224555639"/>
+      <w:bookmarkStart w:id="14" w:name="_Toc227745007"/>
       <w:r>
         <w:t>JavaScript</w:t>
       </w:r>
@@ -4221,7 +4009,7 @@
           <w:noProof/>
         </w:rPr>
       </w:pPr>
-      <w:bookmarkStart w:id="15" w:name="_Toc224555640"/>
+      <w:bookmarkStart w:id="15" w:name="_Toc227745008"/>
       <w:r>
         <w:rPr>
           <w:noProof/>
@@ -4347,7 +4135,7 @@
       <w:pPr>
         <w:pStyle w:val="Cmsor3"/>
       </w:pPr>
-      <w:bookmarkStart w:id="16" w:name="_Toc224555641"/>
+      <w:bookmarkStart w:id="16" w:name="_Toc227745009"/>
       <w:r>
         <w:t>C#</w:t>
       </w:r>
@@ -4472,7 +4260,7 @@
           <w:noProof/>
         </w:rPr>
       </w:pPr>
-      <w:bookmarkStart w:id="17" w:name="_Toc224555642"/>
+      <w:bookmarkStart w:id="17" w:name="_Toc227745010"/>
       <w:r>
         <w:rPr>
           <w:noProof/>
@@ -4584,7 +4372,7 @@
       <w:pPr>
         <w:pStyle w:val="Cmsor2"/>
       </w:pPr>
-      <w:bookmarkStart w:id="18" w:name="_Toc224555643"/>
+      <w:bookmarkStart w:id="18" w:name="_Toc227745011"/>
       <w:r>
         <w:lastRenderedPageBreak/>
         <w:t>További webfejlesztési eszközök</w:t>
@@ -4595,7 +4383,7 @@
       <w:pPr>
         <w:pStyle w:val="Cmsor3"/>
       </w:pPr>
-      <w:bookmarkStart w:id="19" w:name="_Toc224555644"/>
+      <w:bookmarkStart w:id="19" w:name="_Toc227745012"/>
       <w:r>
         <w:t>XAMPP</w:t>
       </w:r>
@@ -5144,7 +4932,7 @@
       <w:pPr>
         <w:pStyle w:val="Cmsor3"/>
       </w:pPr>
-      <w:bookmarkStart w:id="20" w:name="_Toc224555645"/>
+      <w:bookmarkStart w:id="20" w:name="_Toc227745013"/>
       <w:r>
         <w:rPr>
           <w:noProof/>
@@ -5494,7 +5282,7 @@
       <w:pPr>
         <w:pStyle w:val="Cmsor3"/>
       </w:pPr>
-      <w:bookmarkStart w:id="21" w:name="_Toc224555646"/>
+      <w:bookmarkStart w:id="21" w:name="_Toc227745014"/>
       <w:r>
         <w:lastRenderedPageBreak/>
         <w:t>N</w:t>
@@ -5589,7 +5377,7 @@
       <w:pPr>
         <w:pStyle w:val="Cmsor3"/>
       </w:pPr>
-      <w:bookmarkStart w:id="22" w:name="_Toc224555647"/>
+      <w:bookmarkStart w:id="22" w:name="_Toc227745015"/>
       <w:r>
         <w:t>Node</w:t>
       </w:r>
@@ -5705,7 +5493,7 @@
       <w:pPr>
         <w:pStyle w:val="Cmsor1"/>
       </w:pPr>
-      <w:bookmarkStart w:id="23" w:name="_Toc224555648"/>
+      <w:bookmarkStart w:id="23" w:name="_Toc227745016"/>
       <w:r>
         <w:lastRenderedPageBreak/>
         <w:t>Kód dokumentáció</w:t>
@@ -5716,7 +5504,7 @@
       <w:pPr>
         <w:pStyle w:val="Cmsor2"/>
       </w:pPr>
-      <w:bookmarkStart w:id="24" w:name="_Toc224555649"/>
+      <w:bookmarkStart w:id="24" w:name="_Toc227745017"/>
       <w:r>
         <w:t>Adatbázis terv</w:t>
       </w:r>
@@ -7173,7 +6961,7 @@
       <w:pPr>
         <w:pStyle w:val="Cmsor2"/>
       </w:pPr>
-      <w:bookmarkStart w:id="25" w:name="_Toc224555650"/>
+      <w:bookmarkStart w:id="25" w:name="_Toc227745018"/>
       <w:r>
         <w:lastRenderedPageBreak/>
         <w:t>Frontend</w:t>
@@ -7847,7 +7635,7 @@
         </w:numPr>
         <w:ind w:left="284" w:hanging="284"/>
       </w:pPr>
-      <w:bookmarkStart w:id="26" w:name="_Toc224555651"/>
+      <w:bookmarkStart w:id="26" w:name="_Toc227745019"/>
       <w:r>
         <w:rPr>
           <w:noProof/>
@@ -8006,7 +7794,7 @@
       <w:pPr>
         <w:pStyle w:val="Cmsor2"/>
       </w:pPr>
-      <w:bookmarkStart w:id="27" w:name="_Toc224555652"/>
+      <w:bookmarkStart w:id="27" w:name="_Toc227745020"/>
       <w:r>
         <w:t>Backend</w:t>
       </w:r>
@@ -8195,6 +7983,7 @@
       <w:r>
         <w:t xml:space="preserve">elkülönített rétegekre bontottuk: </w:t>
       </w:r>
+      <w:proofErr w:type="spellStart"/>
       <w:r>
         <w:rPr>
           <w:b/>
@@ -8202,15 +7991,25 @@
         </w:rPr>
         <w:t>routeok</w:t>
       </w:r>
+      <w:proofErr w:type="spellEnd"/>
       <w:r>
         <w:t xml:space="preserve"> kezelik a beérkező kéréseket és az útvonalakat, a </w:t>
       </w:r>
-      <w:r>
-        <w:rPr>
-          <w:b/>
-          <w:bCs/>
-        </w:rPr>
-        <w:t xml:space="preserve">controllerek </w:t>
+      <w:proofErr w:type="spellStart"/>
+      <w:r>
+        <w:rPr>
+          <w:b/>
+          <w:bCs/>
+        </w:rPr>
+        <w:t>controllerek</w:t>
+      </w:r>
+      <w:proofErr w:type="spellEnd"/>
+      <w:r>
+        <w:rPr>
+          <w:b/>
+          <w:bCs/>
+        </w:rPr>
+        <w:t xml:space="preserve"> </w:t>
       </w:r>
       <w:r>
         <w:t xml:space="preserve">tartalmazzák az üzleti logikát, míg a </w:t>
@@ -8241,7 +8040,7 @@
         </w:numPr>
         <w:ind w:left="340" w:hanging="340"/>
       </w:pPr>
-      <w:bookmarkStart w:id="28" w:name="_Toc224555653"/>
+      <w:bookmarkStart w:id="28" w:name="_Toc227745021"/>
       <w:r>
         <w:rPr>
           <w:noProof/>
@@ -8408,7 +8207,7 @@
         </w:numPr>
         <w:ind w:left="340" w:hanging="340"/>
       </w:pPr>
-      <w:bookmarkStart w:id="29" w:name="_Toc224555654"/>
+      <w:bookmarkStart w:id="29" w:name="_Toc227745022"/>
       <w:r>
         <w:rPr>
           <w:noProof/>
@@ -8731,7 +8530,7 @@
         </w:numPr>
         <w:ind w:left="340" w:hanging="340"/>
       </w:pPr>
-      <w:bookmarkStart w:id="30" w:name="_Toc224555655"/>
+      <w:bookmarkStart w:id="30" w:name="_Toc227745023"/>
       <w:r>
         <w:rPr>
           <w:noProof/>
@@ -9038,7 +8837,7 @@
       <w:pPr>
         <w:pStyle w:val="Cmsor1"/>
       </w:pPr>
-      <w:bookmarkStart w:id="31" w:name="_Toc224555656"/>
+      <w:bookmarkStart w:id="31" w:name="_Toc227745024"/>
       <w:r>
         <w:lastRenderedPageBreak/>
         <w:t>Fejlesztési lehetőségek</w:t>
@@ -9346,7 +9145,7 @@
       <w:pPr>
         <w:pStyle w:val="Cmsor1"/>
       </w:pPr>
-      <w:bookmarkStart w:id="32" w:name="_Toc224555657"/>
+      <w:bookmarkStart w:id="32" w:name="_Toc227745025"/>
       <w:r>
         <w:lastRenderedPageBreak/>
         <w:t>Tesztelés</w:t>
@@ -9378,8 +9177,17 @@
         <w:t>backend API</w:t>
       </w:r>
       <w:r>
-        <w:t xml:space="preserve">-jának automatizált tesztelését valósítja meg </w:t>
-      </w:r>
+        <w:t>-</w:t>
+      </w:r>
+      <w:proofErr w:type="spellStart"/>
+      <w:r>
+        <w:t>jának</w:t>
+      </w:r>
+      <w:proofErr w:type="spellEnd"/>
+      <w:r>
+        <w:t xml:space="preserve"> automatizált tesztelését valósítja meg </w:t>
+      </w:r>
+      <w:proofErr w:type="spellStart"/>
       <w:r>
         <w:rPr>
           <w:b/>
@@ -9387,9 +9195,11 @@
         </w:rPr>
         <w:t>Jest</w:t>
       </w:r>
+      <w:proofErr w:type="spellEnd"/>
       <w:r>
         <w:t xml:space="preserve"> és </w:t>
       </w:r>
+      <w:proofErr w:type="spellStart"/>
       <w:r>
         <w:rPr>
           <w:b/>
@@ -9397,6 +9207,7 @@
         </w:rPr>
         <w:t>Supertest</w:t>
       </w:r>
+      <w:proofErr w:type="spellEnd"/>
       <w:r>
         <w:t xml:space="preserve"> segítségével. A célja annak ellenőrzése, hogy a felhasználói regisztrációval és bejelentkezéssel kapcsolatos végpontok megfelelően működnek, valamint a legfontosabb </w:t>
       </w:r>
@@ -9416,11 +9227,20 @@
         <w:ind w:firstLine="0"/>
       </w:pPr>
       <w:r>
-        <w:t>A tesztkód a supertest csomagot használja az Express alkalmazás HTTP végpontjainak szimulált hívására, így valódi szerverindítás nélkül tudjuk vizsgálni az API működését. A</w:t>
+        <w:t xml:space="preserve">A tesztkód a </w:t>
+      </w:r>
+      <w:proofErr w:type="spellStart"/>
+      <w:r>
+        <w:t>supertest</w:t>
+      </w:r>
+      <w:proofErr w:type="spellEnd"/>
+      <w:r>
+        <w:t xml:space="preserve"> csomagot használja az Express alkalmazás HTTP végpontjainak szimulált hívására, így valódi szerverindítás nélkül tudjuk vizsgálni az API működését. A</w:t>
       </w:r>
       <w:r>
         <w:t xml:space="preserve"> </w:t>
       </w:r>
+      <w:proofErr w:type="spellStart"/>
       <w:r>
         <w:rPr>
           <w:b/>
@@ -9428,12 +9248,14 @@
         </w:rPr>
         <w:t>jestmock</w:t>
       </w:r>
+      <w:proofErr w:type="spellEnd"/>
       <w:r>
         <w:t xml:space="preserve"> </w:t>
       </w:r>
       <w:r>
         <w:t>segítségével a felhasználói adatbázis-modell (</w:t>
       </w:r>
+      <w:proofErr w:type="spellStart"/>
       <w:r>
         <w:rPr>
           <w:b/>
@@ -9441,9 +9263,11 @@
         </w:rPr>
         <w:t>mainModel</w:t>
       </w:r>
+      <w:proofErr w:type="spellEnd"/>
       <w:r>
         <w:t xml:space="preserve">) és a </w:t>
       </w:r>
+      <w:proofErr w:type="spellStart"/>
       <w:r>
         <w:rPr>
           <w:b/>
@@ -9451,8 +9275,17 @@
         </w:rPr>
         <w:t>bcrypt</w:t>
       </w:r>
-      <w:r>
-        <w:t xml:space="preserve"> jelszókezelő könyvtár működése ki van mockolva, vagyis nem történik valódi adatbázis-művelet. Ez gyorsabbá, megbízhatóbbá teszi a tesztelést.</w:t>
+      <w:proofErr w:type="spellEnd"/>
+      <w:r>
+        <w:t xml:space="preserve"> jelszókezelő könyvtár működése ki van </w:t>
+      </w:r>
+      <w:proofErr w:type="spellStart"/>
+      <w:r>
+        <w:t>mockolva</w:t>
+      </w:r>
+      <w:proofErr w:type="spellEnd"/>
+      <w:r>
+        <w:t>, vagyis nem történik valódi adatbázis-művelet. Ez gyorsabbá, megbízhatóbbá teszi a tesztelést.</w:t>
       </w:r>
     </w:p>
     <w:p>
@@ -9472,7 +9305,15 @@
         </w:numPr>
       </w:pPr>
       <w:r>
-        <w:t>Regisztráció (POST /users/register)</w:t>
+        <w:t>Regisztráció (POST /users/</w:t>
+      </w:r>
+      <w:proofErr w:type="spellStart"/>
+      <w:r>
+        <w:t>register</w:t>
+      </w:r>
+      <w:proofErr w:type="spellEnd"/>
+      <w:r>
+        <w:t>)</w:t>
       </w:r>
     </w:p>
     <w:p>
@@ -9604,7 +9445,15 @@
         </w:numPr>
       </w:pPr>
       <w:r>
-        <w:t>Regisztrációs oldal (/register)</w:t>
+        <w:t>Regisztrációs oldal (/</w:t>
+      </w:r>
+      <w:proofErr w:type="spellStart"/>
+      <w:r>
+        <w:t>register</w:t>
+      </w:r>
+      <w:proofErr w:type="spellEnd"/>
+      <w:r>
+        <w:t>)</w:t>
       </w:r>
     </w:p>
     <w:p>
@@ -9791,7 +9640,7 @@
       <w:pPr>
         <w:pStyle w:val="Cmsor1"/>
       </w:pPr>
-      <w:bookmarkStart w:id="33" w:name="_Toc224555658"/>
+      <w:bookmarkStart w:id="33" w:name="_Toc227745026"/>
       <w:r>
         <w:lastRenderedPageBreak/>
         <w:t>Projektmenedzsment</w:t>
@@ -9805,7 +9654,8 @@
           <w:rStyle w:val="Cmsor2Char"/>
         </w:rPr>
       </w:pPr>
-      <w:bookmarkStart w:id="34" w:name="_Toc224555659"/>
+      <w:bookmarkStart w:id="34" w:name="_Toc227745027"/>
+      <w:proofErr w:type="spellStart"/>
       <w:r>
         <w:rPr>
           <w:rStyle w:val="Cmsor2Char"/>
@@ -9813,13 +9663,22 @@
         <w:t>Jira</w:t>
       </w:r>
       <w:bookmarkEnd w:id="34"/>
+      <w:proofErr w:type="spellEnd"/>
     </w:p>
     <w:p>
       <w:pPr>
         <w:ind w:firstLine="0"/>
       </w:pPr>
       <w:r>
-        <w:t>A Jira egy széles körben használt projektmenedzsment és hibakövető rendszer. Lehetővé teszi a feladatok, hibák és fejlesztési igények nyomon követését, priorizálását és státusz szerinti kezelését.</w:t>
+        <w:t xml:space="preserve">A </w:t>
+      </w:r>
+      <w:proofErr w:type="spellStart"/>
+      <w:r>
+        <w:t>Jira</w:t>
+      </w:r>
+      <w:proofErr w:type="spellEnd"/>
+      <w:r>
+        <w:t xml:space="preserve"> egy széles körben használt projektmenedzsment és hibakövető rendszer. Lehetővé teszi a feladatok, hibák és fejlesztési igények nyomon követését, priorizálását és státusz szerinti kezelését.</w:t>
       </w:r>
     </w:p>
     <w:p>
@@ -9887,7 +9746,15 @@
         </w:drawing>
       </w:r>
       <w:r>
-        <w:t>A projekt során a feladatokat ezen a felületen keresztül osztottuk el a csapattagok között. A Jira segítségével egyértelműen rögzítettük a felelősöket, határidőket és az aktuális állapotot, így mindenki átlátható módon követhette a saját és a közös munkafolyamatok előrehaladását.</w:t>
+        <w:t xml:space="preserve">A projekt során a feladatokat ezen a felületen keresztül osztottuk el a csapattagok között. A </w:t>
+      </w:r>
+      <w:proofErr w:type="spellStart"/>
+      <w:r>
+        <w:t>Jira</w:t>
+      </w:r>
+      <w:proofErr w:type="spellEnd"/>
+      <w:r>
+        <w:t xml:space="preserve"> segítségével egyértelműen rögzítettük a felelősöket, határidőket és az aktuális állapotot, így mindenki átlátható módon követhette a saját és a közös munkafolyamatok előrehaladását.</w:t>
       </w:r>
     </w:p>
     <w:p>
@@ -10042,11 +9909,16 @@
       <w:pPr>
         <w:pStyle w:val="Cmsor2"/>
       </w:pPr>
-      <w:bookmarkStart w:id="35" w:name="_Toc224555660"/>
-      <w:r>
-        <w:t>Git &amp; Github</w:t>
+      <w:bookmarkStart w:id="35" w:name="_Toc227745028"/>
+      <w:r>
+        <w:t xml:space="preserve">Git &amp; </w:t>
+      </w:r>
+      <w:proofErr w:type="spellStart"/>
+      <w:r>
+        <w:t>Github</w:t>
       </w:r>
       <w:bookmarkEnd w:id="35"/>
+      <w:proofErr w:type="spellEnd"/>
     </w:p>
     <w:p>
       <w:pPr>
@@ -10141,7 +10013,31 @@
         <w:t>GitHub</w:t>
       </w:r>
       <w:r>
-        <w:t xml:space="preserve"> felületén kezeltük a teljes forráskódot, itt hoztuk létre és egyesítettük a brancheket, valamint pull requesteken keresztül végeztük a kódellenőrzést. A feladatokhoz kapcsolódó módosításokat itt dokumentáltuk, így a fejlesztési folyamat átlátható és visszakövethető maradt a csapat minden tagja számára.</w:t>
+        <w:t xml:space="preserve"> felületén kezeltük a teljes forráskódot, itt hoztuk létre és egyesítettük a </w:t>
+      </w:r>
+      <w:proofErr w:type="spellStart"/>
+      <w:r>
+        <w:t>brancheket</w:t>
+      </w:r>
+      <w:proofErr w:type="spellEnd"/>
+      <w:r>
+        <w:t xml:space="preserve">, valamint </w:t>
+      </w:r>
+      <w:proofErr w:type="spellStart"/>
+      <w:r>
+        <w:t>pull</w:t>
+      </w:r>
+      <w:proofErr w:type="spellEnd"/>
+      <w:r>
+        <w:t xml:space="preserve"> </w:t>
+      </w:r>
+      <w:proofErr w:type="spellStart"/>
+      <w:r>
+        <w:t>requesteken</w:t>
+      </w:r>
+      <w:proofErr w:type="spellEnd"/>
+      <w:r>
+        <w:t xml:space="preserve"> keresztül végeztük a kódellenőrzést. A feladatokhoz kapcsolódó módosításokat itt dokumentáltuk, így a fejlesztési folyamat átlátható és visszakövethető maradt a csapat minden tagja számára.</w:t>
       </w:r>
     </w:p>
     <w:p/>

</xml_diff>

<commit_message>
added adminpage to documentation
</commit_message>
<xml_diff>
--- a/Dokumentáció/Fejlesztoi_dokumentacio.docx
+++ b/Dokumentáció/Fejlesztoi_dokumentacio.docx
@@ -26,7 +26,7 @@
       <w:pPr>
         <w:pStyle w:val="Cmsor1"/>
       </w:pPr>
-      <w:bookmarkStart w:id="0" w:name="_Toc227744993"/>
+      <w:bookmarkStart w:id="0" w:name="_Toc227916139"/>
       <w:r>
         <w:t>Tartalomjegyzék</w:t>
       </w:r>
@@ -110,7 +110,7 @@
         <w:rPr>
           <w:noProof/>
         </w:rPr>
-        <w:instrText xml:space="preserve"> PAGEREF _Toc227744993 \h </w:instrText>
+        <w:instrText xml:space="preserve"> PAGEREF _Toc227916139 \h </w:instrText>
       </w:r>
       <w:r>
         <w:rPr>
@@ -187,7 +187,7 @@
         <w:rPr>
           <w:noProof/>
         </w:rPr>
-        <w:instrText xml:space="preserve"> PAGEREF _Toc227744994 \h </w:instrText>
+        <w:instrText xml:space="preserve"> PAGEREF _Toc227916140 \h </w:instrText>
       </w:r>
       <w:r>
         <w:rPr>
@@ -264,7 +264,7 @@
         <w:rPr>
           <w:noProof/>
         </w:rPr>
-        <w:instrText xml:space="preserve"> PAGEREF _Toc227744995 \h </w:instrText>
+        <w:instrText xml:space="preserve"> PAGEREF _Toc227916141 \h </w:instrText>
       </w:r>
       <w:r>
         <w:rPr>
@@ -341,7 +341,7 @@
         <w:rPr>
           <w:noProof/>
         </w:rPr>
-        <w:instrText xml:space="preserve"> PAGEREF _Toc227744996 \h </w:instrText>
+        <w:instrText xml:space="preserve"> PAGEREF _Toc227916142 \h </w:instrText>
       </w:r>
       <w:r>
         <w:rPr>
@@ -418,7 +418,7 @@
         <w:rPr>
           <w:noProof/>
         </w:rPr>
-        <w:instrText xml:space="preserve"> PAGEREF _Toc227744997 \h </w:instrText>
+        <w:instrText xml:space="preserve"> PAGEREF _Toc227916143 \h </w:instrText>
       </w:r>
       <w:r>
         <w:rPr>
@@ -495,7 +495,7 @@
         <w:rPr>
           <w:noProof/>
         </w:rPr>
-        <w:instrText xml:space="preserve"> PAGEREF _Toc227744998 \h </w:instrText>
+        <w:instrText xml:space="preserve"> PAGEREF _Toc227916144 \h </w:instrText>
       </w:r>
       <w:r>
         <w:rPr>
@@ -572,7 +572,7 @@
         <w:rPr>
           <w:noProof/>
         </w:rPr>
-        <w:instrText xml:space="preserve"> PAGEREF _Toc227744999 \h </w:instrText>
+        <w:instrText xml:space="preserve"> PAGEREF _Toc227916145 \h </w:instrText>
       </w:r>
       <w:r>
         <w:rPr>
@@ -649,7 +649,7 @@
         <w:rPr>
           <w:noProof/>
         </w:rPr>
-        <w:instrText xml:space="preserve"> PAGEREF _Toc227745000 \h </w:instrText>
+        <w:instrText xml:space="preserve"> PAGEREF _Toc227916146 \h </w:instrText>
       </w:r>
       <w:r>
         <w:rPr>
@@ -726,7 +726,7 @@
         <w:rPr>
           <w:noProof/>
         </w:rPr>
-        <w:instrText xml:space="preserve"> PAGEREF _Toc227745001 \h </w:instrText>
+        <w:instrText xml:space="preserve"> PAGEREF _Toc227916147 \h </w:instrText>
       </w:r>
       <w:r>
         <w:rPr>
@@ -803,7 +803,7 @@
         <w:rPr>
           <w:noProof/>
         </w:rPr>
-        <w:instrText xml:space="preserve"> PAGEREF _Toc227745002 \h </w:instrText>
+        <w:instrText xml:space="preserve"> PAGEREF _Toc227916148 \h </w:instrText>
       </w:r>
       <w:r>
         <w:rPr>
@@ -880,7 +880,7 @@
         <w:rPr>
           <w:noProof/>
         </w:rPr>
-        <w:instrText xml:space="preserve"> PAGEREF _Toc227745003 \h </w:instrText>
+        <w:instrText xml:space="preserve"> PAGEREF _Toc227916149 \h </w:instrText>
       </w:r>
       <w:r>
         <w:rPr>
@@ -957,7 +957,7 @@
         <w:rPr>
           <w:noProof/>
         </w:rPr>
-        <w:instrText xml:space="preserve"> PAGEREF _Toc227745004 \h </w:instrText>
+        <w:instrText xml:space="preserve"> PAGEREF _Toc227916150 \h </w:instrText>
       </w:r>
       <w:r>
         <w:rPr>
@@ -1034,7 +1034,7 @@
         <w:rPr>
           <w:noProof/>
         </w:rPr>
-        <w:instrText xml:space="preserve"> PAGEREF _Toc227745005 \h </w:instrText>
+        <w:instrText xml:space="preserve"> PAGEREF _Toc227916151 \h </w:instrText>
       </w:r>
       <w:r>
         <w:rPr>
@@ -1111,7 +1111,7 @@
         <w:rPr>
           <w:noProof/>
         </w:rPr>
-        <w:instrText xml:space="preserve"> PAGEREF _Toc227745006 \h </w:instrText>
+        <w:instrText xml:space="preserve"> PAGEREF _Toc227916152 \h </w:instrText>
       </w:r>
       <w:r>
         <w:rPr>
@@ -1188,7 +1188,7 @@
         <w:rPr>
           <w:noProof/>
         </w:rPr>
-        <w:instrText xml:space="preserve"> PAGEREF _Toc227745007 \h </w:instrText>
+        <w:instrText xml:space="preserve"> PAGEREF _Toc227916153 \h </w:instrText>
       </w:r>
       <w:r>
         <w:rPr>
@@ -1265,7 +1265,7 @@
         <w:rPr>
           <w:noProof/>
         </w:rPr>
-        <w:instrText xml:space="preserve"> PAGEREF _Toc227745008 \h </w:instrText>
+        <w:instrText xml:space="preserve"> PAGEREF _Toc227916154 \h </w:instrText>
       </w:r>
       <w:r>
         <w:rPr>
@@ -1342,7 +1342,7 @@
         <w:rPr>
           <w:noProof/>
         </w:rPr>
-        <w:instrText xml:space="preserve"> PAGEREF _Toc227745009 \h </w:instrText>
+        <w:instrText xml:space="preserve"> PAGEREF _Toc227916155 \h </w:instrText>
       </w:r>
       <w:r>
         <w:rPr>
@@ -1419,7 +1419,7 @@
         <w:rPr>
           <w:noProof/>
         </w:rPr>
-        <w:instrText xml:space="preserve"> PAGEREF _Toc227745010 \h </w:instrText>
+        <w:instrText xml:space="preserve"> PAGEREF _Toc227916156 \h </w:instrText>
       </w:r>
       <w:r>
         <w:rPr>
@@ -1496,7 +1496,7 @@
         <w:rPr>
           <w:noProof/>
         </w:rPr>
-        <w:instrText xml:space="preserve"> PAGEREF _Toc227745011 \h </w:instrText>
+        <w:instrText xml:space="preserve"> PAGEREF _Toc227916157 \h </w:instrText>
       </w:r>
       <w:r>
         <w:rPr>
@@ -1573,7 +1573,7 @@
         <w:rPr>
           <w:noProof/>
         </w:rPr>
-        <w:instrText xml:space="preserve"> PAGEREF _Toc227745012 \h </w:instrText>
+        <w:instrText xml:space="preserve"> PAGEREF _Toc227916158 \h </w:instrText>
       </w:r>
       <w:r>
         <w:rPr>
@@ -1650,7 +1650,7 @@
         <w:rPr>
           <w:noProof/>
         </w:rPr>
-        <w:instrText xml:space="preserve"> PAGEREF _Toc227745013 \h </w:instrText>
+        <w:instrText xml:space="preserve"> PAGEREF _Toc227916159 \h </w:instrText>
       </w:r>
       <w:r>
         <w:rPr>
@@ -1727,7 +1727,7 @@
         <w:rPr>
           <w:noProof/>
         </w:rPr>
-        <w:instrText xml:space="preserve"> PAGEREF _Toc227745014 \h </w:instrText>
+        <w:instrText xml:space="preserve"> PAGEREF _Toc227916160 \h </w:instrText>
       </w:r>
       <w:r>
         <w:rPr>
@@ -1804,7 +1804,7 @@
         <w:rPr>
           <w:noProof/>
         </w:rPr>
-        <w:instrText xml:space="preserve"> PAGEREF _Toc227745015 \h </w:instrText>
+        <w:instrText xml:space="preserve"> PAGEREF _Toc227916161 \h </w:instrText>
       </w:r>
       <w:r>
         <w:rPr>
@@ -1881,7 +1881,7 @@
         <w:rPr>
           <w:noProof/>
         </w:rPr>
-        <w:instrText xml:space="preserve"> PAGEREF _Toc227745016 \h </w:instrText>
+        <w:instrText xml:space="preserve"> PAGEREF _Toc227916162 \h </w:instrText>
       </w:r>
       <w:r>
         <w:rPr>
@@ -1959,7 +1959,7 @@
         <w:rPr>
           <w:noProof/>
         </w:rPr>
-        <w:instrText xml:space="preserve"> PAGEREF _Toc227745017 \h </w:instrText>
+        <w:instrText xml:space="preserve"> PAGEREF _Toc227916163 \h </w:instrText>
       </w:r>
       <w:r>
         <w:rPr>
@@ -2036,7 +2036,7 @@
         <w:rPr>
           <w:noProof/>
         </w:rPr>
-        <w:instrText xml:space="preserve"> PAGEREF _Toc227745018 \h </w:instrText>
+        <w:instrText xml:space="preserve"> PAGEREF _Toc227916164 \h </w:instrText>
       </w:r>
       <w:r>
         <w:rPr>
@@ -2113,7 +2113,7 @@
         <w:rPr>
           <w:noProof/>
         </w:rPr>
-        <w:instrText xml:space="preserve"> PAGEREF _Toc227745020 \h </w:instrText>
+        <w:instrText xml:space="preserve"> PAGEREF _Toc227916166 \h </w:instrText>
       </w:r>
       <w:r>
         <w:rPr>
@@ -2131,6 +2131,83 @@
           <w:noProof/>
         </w:rPr>
         <w:t>13</w:t>
+      </w:r>
+      <w:r>
+        <w:rPr>
+          <w:noProof/>
+        </w:rPr>
+        <w:fldChar w:fldCharType="end"/>
+      </w:r>
+    </w:p>
+    <w:p>
+      <w:pPr>
+        <w:pStyle w:val="TJ2"/>
+        <w:tabs>
+          <w:tab w:val="left" w:pos="1320"/>
+          <w:tab w:val="right" w:leader="dot" w:pos="8777"/>
+        </w:tabs>
+        <w:rPr>
+          <w:rFonts w:asciiTheme="minorHAnsi" w:eastAsiaTheme="minorEastAsia" w:hAnsiTheme="minorHAnsi"/>
+          <w:noProof/>
+          <w:sz w:val="22"/>
+          <w:lang w:eastAsia="hu-HU"/>
+        </w:rPr>
+      </w:pPr>
+      <w:r>
+        <w:rPr>
+          <w:noProof/>
+        </w:rPr>
+        <w:t>5.4</w:t>
+      </w:r>
+      <w:r>
+        <w:rPr>
+          <w:rFonts w:asciiTheme="minorHAnsi" w:eastAsiaTheme="minorEastAsia" w:hAnsiTheme="minorHAnsi"/>
+          <w:noProof/>
+          <w:sz w:val="22"/>
+          <w:lang w:eastAsia="hu-HU"/>
+        </w:rPr>
+        <w:tab/>
+      </w:r>
+      <w:r>
+        <w:rPr>
+          <w:noProof/>
+        </w:rPr>
+        <w:t>Admin felület</w:t>
+      </w:r>
+      <w:r>
+        <w:rPr>
+          <w:noProof/>
+        </w:rPr>
+        <w:tab/>
+      </w:r>
+      <w:r>
+        <w:rPr>
+          <w:noProof/>
+        </w:rPr>
+        <w:fldChar w:fldCharType="begin"/>
+      </w:r>
+      <w:r>
+        <w:rPr>
+          <w:noProof/>
+        </w:rPr>
+        <w:instrText xml:space="preserve"> PAGEREF _Toc227916170 \h </w:instrText>
+      </w:r>
+      <w:r>
+        <w:rPr>
+          <w:noProof/>
+        </w:rPr>
+      </w:r>
+      <w:r>
+        <w:rPr>
+          <w:noProof/>
+        </w:rPr>
+        <w:fldChar w:fldCharType="separate"/>
+      </w:r>
+      <w:r>
+        <w:rPr>
+          <w:noProof/>
+        </w:rPr>
+        <w:t>16</w:t>
       </w:r>
       <w:r>
         <w:rPr>
@@ -2190,7 +2267,7 @@
         <w:rPr>
           <w:noProof/>
         </w:rPr>
-        <w:instrText xml:space="preserve"> PAGEREF _Toc227745024 \h </w:instrText>
+        <w:instrText xml:space="preserve"> PAGEREF _Toc227916171 \h </w:instrText>
       </w:r>
       <w:r>
         <w:rPr>
@@ -2207,7 +2284,7 @@
         <w:rPr>
           <w:noProof/>
         </w:rPr>
-        <w:t>16</w:t>
+        <w:t>20</w:t>
       </w:r>
       <w:r>
         <w:rPr>
@@ -2267,7 +2344,7 @@
         <w:rPr>
           <w:noProof/>
         </w:rPr>
-        <w:instrText xml:space="preserve"> PAGEREF _Toc227745025 \h </w:instrText>
+        <w:instrText xml:space="preserve"> PAGEREF _Toc227916172 \h </w:instrText>
       </w:r>
       <w:r>
         <w:rPr>
@@ -2284,7 +2361,7 @@
         <w:rPr>
           <w:noProof/>
         </w:rPr>
-        <w:t>17</w:t>
+        <w:t>21</w:t>
       </w:r>
       <w:r>
         <w:rPr>
@@ -2344,7 +2421,7 @@
         <w:rPr>
           <w:noProof/>
         </w:rPr>
-        <w:instrText xml:space="preserve"> PAGEREF _Toc227745026 \h </w:instrText>
+        <w:instrText xml:space="preserve"> PAGEREF _Toc227916173 \h </w:instrText>
       </w:r>
       <w:r>
         <w:rPr>
@@ -2361,7 +2438,7 @@
         <w:rPr>
           <w:noProof/>
         </w:rPr>
-        <w:t>19</w:t>
+        <w:t>23</w:t>
       </w:r>
       <w:r>
         <w:rPr>
@@ -2421,7 +2498,7 @@
         <w:rPr>
           <w:noProof/>
         </w:rPr>
-        <w:instrText xml:space="preserve"> PAGEREF _Toc227745027 \h </w:instrText>
+        <w:instrText xml:space="preserve"> PAGEREF _Toc227916174 \h </w:instrText>
       </w:r>
       <w:r>
         <w:rPr>
@@ -2438,7 +2515,7 @@
         <w:rPr>
           <w:noProof/>
         </w:rPr>
-        <w:t>19</w:t>
+        <w:t>23</w:t>
       </w:r>
       <w:r>
         <w:rPr>
@@ -2498,7 +2575,7 @@
         <w:rPr>
           <w:noProof/>
         </w:rPr>
-        <w:instrText xml:space="preserve"> PAGEREF _Toc227745028 \h </w:instrText>
+        <w:instrText xml:space="preserve"> PAGEREF _Toc227916175 \h </w:instrText>
       </w:r>
       <w:r>
         <w:rPr>
@@ -2515,7 +2592,7 @@
         <w:rPr>
           <w:noProof/>
         </w:rPr>
-        <w:t>20</w:t>
+        <w:t>24</w:t>
       </w:r>
       <w:r>
         <w:rPr>
@@ -2570,7 +2647,7 @@
       <w:pPr>
         <w:pStyle w:val="Cmsor1"/>
       </w:pPr>
-      <w:bookmarkStart w:id="1" w:name="_Toc227744994"/>
+      <w:bookmarkStart w:id="1" w:name="_Toc227916140"/>
       <w:r>
         <w:lastRenderedPageBreak/>
         <w:t>A projekt célja és megvalósítása</w:t>
@@ -2581,7 +2658,7 @@
       <w:pPr>
         <w:pStyle w:val="Cmsor2"/>
       </w:pPr>
-      <w:bookmarkStart w:id="2" w:name="_Toc227744995"/>
+      <w:bookmarkStart w:id="2" w:name="_Toc227916141"/>
       <w:r>
         <w:t>Miért ezt választottuk?</w:t>
       </w:r>
@@ -2656,7 +2733,7 @@
       <w:pPr>
         <w:pStyle w:val="Cmsor2"/>
       </w:pPr>
-      <w:bookmarkStart w:id="3" w:name="_Toc227744996"/>
+      <w:bookmarkStart w:id="3" w:name="_Toc227916142"/>
       <w:r>
         <w:t>Mi a célunk?</w:t>
       </w:r>
@@ -2768,7 +2845,7 @@
       <w:pPr>
         <w:pStyle w:val="Cmsor2"/>
       </w:pPr>
-      <w:bookmarkStart w:id="4" w:name="_Toc227744997"/>
+      <w:bookmarkStart w:id="4" w:name="_Toc227916143"/>
       <w:r>
         <w:t>Munkamegosztás</w:t>
       </w:r>
@@ -3218,7 +3295,7 @@
       <w:pPr>
         <w:pStyle w:val="Cmsor1"/>
       </w:pPr>
-      <w:bookmarkStart w:id="5" w:name="_Toc227744998"/>
+      <w:bookmarkStart w:id="5" w:name="_Toc227916144"/>
       <w:r>
         <w:lastRenderedPageBreak/>
         <w:t>Követelmények</w:t>
@@ -3229,7 +3306,7 @@
       <w:pPr>
         <w:pStyle w:val="Cmsor2"/>
       </w:pPr>
-      <w:bookmarkStart w:id="6" w:name="_Toc227744999"/>
+      <w:bookmarkStart w:id="6" w:name="_Toc227916145"/>
       <w:r>
         <w:t>Funkcionális követelmények</w:t>
       </w:r>
@@ -3305,19 +3382,11 @@
         <w:ind w:firstLine="0"/>
       </w:pPr>
       <w:r>
-        <w:t xml:space="preserve">Más böngészőkben — például Firefoxban vagy </w:t>
-      </w:r>
-      <w:proofErr w:type="spellStart"/>
-      <w:r>
-        <w:t>Safari</w:t>
+        <w:t>Más böngészőkben — például Firefoxban vagy Safari</w:t>
       </w:r>
       <w:r>
         <w:softHyphen/>
-        <w:t>ban</w:t>
-      </w:r>
-      <w:proofErr w:type="spellEnd"/>
-      <w:r>
-        <w:t xml:space="preserve"> — előfordulhat, hogy bizonyos funkciók </w:t>
+        <w:t xml:space="preserve">ban — előfordulhat, hogy bizonyos funkciók </w:t>
       </w:r>
       <w:r>
         <w:rPr>
@@ -3364,7 +3433,7 @@
       <w:pPr>
         <w:pStyle w:val="Cmsor1"/>
       </w:pPr>
-      <w:bookmarkStart w:id="7" w:name="_Toc227745000"/>
+      <w:bookmarkStart w:id="7" w:name="_Toc227916146"/>
       <w:r>
         <w:lastRenderedPageBreak/>
         <w:t>A projektben használt webfejlesztési technológiák</w:t>
@@ -3413,7 +3482,7 @@
       <w:pPr>
         <w:pStyle w:val="Cmsor2"/>
       </w:pPr>
-      <w:bookmarkStart w:id="8" w:name="_Toc227745001"/>
+      <w:bookmarkStart w:id="8" w:name="_Toc227916147"/>
       <w:r>
         <w:t>Fejlesztői környezetek</w:t>
       </w:r>
@@ -3423,7 +3492,7 @@
       <w:pPr>
         <w:pStyle w:val="Cmsor3"/>
       </w:pPr>
-      <w:bookmarkStart w:id="9" w:name="_Toc227745002"/>
+      <w:bookmarkStart w:id="9" w:name="_Toc227916148"/>
       <w:r>
         <w:t>Visual Studio Code</w:t>
       </w:r>
@@ -3533,7 +3602,7 @@
       <w:pPr>
         <w:pStyle w:val="Cmsor3"/>
       </w:pPr>
-      <w:bookmarkStart w:id="10" w:name="_Toc227745003"/>
+      <w:bookmarkStart w:id="10" w:name="_Toc227916149"/>
       <w:r>
         <w:t>Visual Studio</w:t>
       </w:r>
@@ -3642,7 +3711,7 @@
       <w:pPr>
         <w:pStyle w:val="Cmsor2"/>
       </w:pPr>
-      <w:bookmarkStart w:id="11" w:name="_Toc227745004"/>
+      <w:bookmarkStart w:id="11" w:name="_Toc227916150"/>
       <w:r>
         <w:t>Programozási nyelvek</w:t>
       </w:r>
@@ -3652,7 +3721,7 @@
       <w:pPr>
         <w:pStyle w:val="Cmsor3"/>
       </w:pPr>
-      <w:bookmarkStart w:id="12" w:name="_Toc227745005"/>
+      <w:bookmarkStart w:id="12" w:name="_Toc227916151"/>
       <w:r>
         <w:t>HTML</w:t>
       </w:r>
@@ -3760,7 +3829,7 @@
       <w:pPr>
         <w:pStyle w:val="Cmsor3"/>
       </w:pPr>
-      <w:bookmarkStart w:id="13" w:name="_Toc227745006"/>
+      <w:bookmarkStart w:id="13" w:name="_Toc227916152"/>
       <w:r>
         <w:rPr>
           <w:noProof/>
@@ -3883,7 +3952,7 @@
       <w:pPr>
         <w:pStyle w:val="Cmsor3"/>
       </w:pPr>
-      <w:bookmarkStart w:id="14" w:name="_Toc227745007"/>
+      <w:bookmarkStart w:id="14" w:name="_Toc227916153"/>
       <w:r>
         <w:t>JavaScript</w:t>
       </w:r>
@@ -4009,7 +4078,7 @@
           <w:noProof/>
         </w:rPr>
       </w:pPr>
-      <w:bookmarkStart w:id="15" w:name="_Toc227745008"/>
+      <w:bookmarkStart w:id="15" w:name="_Toc227916154"/>
       <w:r>
         <w:rPr>
           <w:noProof/>
@@ -4135,7 +4204,7 @@
       <w:pPr>
         <w:pStyle w:val="Cmsor3"/>
       </w:pPr>
-      <w:bookmarkStart w:id="16" w:name="_Toc227745009"/>
+      <w:bookmarkStart w:id="16" w:name="_Toc227916155"/>
       <w:r>
         <w:t>C#</w:t>
       </w:r>
@@ -4260,7 +4329,7 @@
           <w:noProof/>
         </w:rPr>
       </w:pPr>
-      <w:bookmarkStart w:id="17" w:name="_Toc227745010"/>
+      <w:bookmarkStart w:id="17" w:name="_Toc227916156"/>
       <w:r>
         <w:rPr>
           <w:noProof/>
@@ -4372,7 +4441,7 @@
       <w:pPr>
         <w:pStyle w:val="Cmsor2"/>
       </w:pPr>
-      <w:bookmarkStart w:id="18" w:name="_Toc227745011"/>
+      <w:bookmarkStart w:id="18" w:name="_Toc227916157"/>
       <w:r>
         <w:lastRenderedPageBreak/>
         <w:t>További webfejlesztési eszközök</w:t>
@@ -4383,7 +4452,7 @@
       <w:pPr>
         <w:pStyle w:val="Cmsor3"/>
       </w:pPr>
-      <w:bookmarkStart w:id="19" w:name="_Toc227745012"/>
+      <w:bookmarkStart w:id="19" w:name="_Toc227916158"/>
       <w:r>
         <w:t>XAMPP</w:t>
       </w:r>
@@ -4932,7 +5001,7 @@
       <w:pPr>
         <w:pStyle w:val="Cmsor3"/>
       </w:pPr>
-      <w:bookmarkStart w:id="20" w:name="_Toc227745013"/>
+      <w:bookmarkStart w:id="20" w:name="_Toc227916159"/>
       <w:r>
         <w:rPr>
           <w:noProof/>
@@ -5282,7 +5351,7 @@
       <w:pPr>
         <w:pStyle w:val="Cmsor3"/>
       </w:pPr>
-      <w:bookmarkStart w:id="21" w:name="_Toc227745014"/>
+      <w:bookmarkStart w:id="21" w:name="_Toc227916160"/>
       <w:r>
         <w:lastRenderedPageBreak/>
         <w:t>N</w:t>
@@ -5377,7 +5446,7 @@
       <w:pPr>
         <w:pStyle w:val="Cmsor3"/>
       </w:pPr>
-      <w:bookmarkStart w:id="22" w:name="_Toc227745015"/>
+      <w:bookmarkStart w:id="22" w:name="_Toc227916161"/>
       <w:r>
         <w:t>Node</w:t>
       </w:r>
@@ -5493,7 +5562,7 @@
       <w:pPr>
         <w:pStyle w:val="Cmsor1"/>
       </w:pPr>
-      <w:bookmarkStart w:id="23" w:name="_Toc227745016"/>
+      <w:bookmarkStart w:id="23" w:name="_Toc227916162"/>
       <w:r>
         <w:lastRenderedPageBreak/>
         <w:t>Kód dokumentáció</w:t>
@@ -5504,7 +5573,7 @@
       <w:pPr>
         <w:pStyle w:val="Cmsor2"/>
       </w:pPr>
-      <w:bookmarkStart w:id="24" w:name="_Toc227745017"/>
+      <w:bookmarkStart w:id="24" w:name="_Toc227916163"/>
       <w:r>
         <w:t>Adatbázis terv</w:t>
       </w:r>
@@ -6961,7 +7030,7 @@
       <w:pPr>
         <w:pStyle w:val="Cmsor2"/>
       </w:pPr>
-      <w:bookmarkStart w:id="25" w:name="_Toc227745018"/>
+      <w:bookmarkStart w:id="25" w:name="_Toc227916164"/>
       <w:r>
         <w:lastRenderedPageBreak/>
         <w:t>Frontend</w:t>
@@ -7636,6 +7705,7 @@
         <w:ind w:left="284" w:hanging="284"/>
       </w:pPr>
       <w:bookmarkStart w:id="26" w:name="_Toc227745019"/>
+      <w:bookmarkStart w:id="27" w:name="_Toc227916165"/>
       <w:r>
         <w:rPr>
           <w:noProof/>
@@ -7789,16 +7859,17 @@
         </w:drawing>
       </w:r>
       <w:bookmarkEnd w:id="26"/>
+      <w:bookmarkEnd w:id="27"/>
     </w:p>
     <w:p>
       <w:pPr>
         <w:pStyle w:val="Cmsor2"/>
       </w:pPr>
-      <w:bookmarkStart w:id="27" w:name="_Toc227745020"/>
+      <w:bookmarkStart w:id="28" w:name="_Toc227916166"/>
       <w:r>
         <w:t>Backend</w:t>
       </w:r>
-      <w:bookmarkEnd w:id="27"/>
+      <w:bookmarkEnd w:id="28"/>
     </w:p>
     <w:p>
       <w:pPr>
@@ -7983,7 +8054,6 @@
       <w:r>
         <w:t xml:space="preserve">elkülönített rétegekre bontottuk: </w:t>
       </w:r>
-      <w:proofErr w:type="spellStart"/>
       <w:r>
         <w:rPr>
           <w:b/>
@@ -7991,25 +8061,15 @@
         </w:rPr>
         <w:t>routeok</w:t>
       </w:r>
-      <w:proofErr w:type="spellEnd"/>
       <w:r>
         <w:t xml:space="preserve"> kezelik a beérkező kéréseket és az útvonalakat, a </w:t>
       </w:r>
-      <w:proofErr w:type="spellStart"/>
-      <w:r>
-        <w:rPr>
-          <w:b/>
-          <w:bCs/>
-        </w:rPr>
-        <w:t>controllerek</w:t>
-      </w:r>
-      <w:proofErr w:type="spellEnd"/>
-      <w:r>
-        <w:rPr>
-          <w:b/>
-          <w:bCs/>
-        </w:rPr>
-        <w:t xml:space="preserve"> </w:t>
+      <w:r>
+        <w:rPr>
+          <w:b/>
+          <w:bCs/>
+        </w:rPr>
+        <w:t xml:space="preserve">controllerek </w:t>
       </w:r>
       <w:r>
         <w:t xml:space="preserve">tartalmazzák az üzleti logikát, míg a </w:t>
@@ -8040,7 +8100,8 @@
         </w:numPr>
         <w:ind w:left="340" w:hanging="340"/>
       </w:pPr>
-      <w:bookmarkStart w:id="28" w:name="_Toc227745021"/>
+      <w:bookmarkStart w:id="29" w:name="_Toc227745021"/>
+      <w:bookmarkStart w:id="30" w:name="_Toc227916167"/>
       <w:r>
         <w:rPr>
           <w:noProof/>
@@ -8196,7 +8257,8 @@
           </mc:Fallback>
         </mc:AlternateContent>
       </w:r>
-      <w:bookmarkEnd w:id="28"/>
+      <w:bookmarkEnd w:id="29"/>
+      <w:bookmarkEnd w:id="30"/>
     </w:p>
     <w:p>
       <w:pPr>
@@ -8207,7 +8269,8 @@
         </w:numPr>
         <w:ind w:left="340" w:hanging="340"/>
       </w:pPr>
-      <w:bookmarkStart w:id="29" w:name="_Toc227745022"/>
+      <w:bookmarkStart w:id="31" w:name="_Toc227745022"/>
+      <w:bookmarkStart w:id="32" w:name="_Toc227916168"/>
       <w:r>
         <w:rPr>
           <w:noProof/>
@@ -8516,7 +8579,8 @@
           </mc:Fallback>
         </mc:AlternateContent>
       </w:r>
-      <w:bookmarkEnd w:id="29"/>
+      <w:bookmarkEnd w:id="31"/>
+      <w:bookmarkEnd w:id="32"/>
       <w:r>
         <w:br w:type="page"/>
       </w:r>
@@ -8530,7 +8594,8 @@
         </w:numPr>
         <w:ind w:left="340" w:hanging="340"/>
       </w:pPr>
-      <w:bookmarkStart w:id="30" w:name="_Toc227745023"/>
+      <w:bookmarkStart w:id="33" w:name="_Toc227745023"/>
+      <w:bookmarkStart w:id="34" w:name="_Toc227916169"/>
       <w:r>
         <w:rPr>
           <w:noProof/>
@@ -8828,21 +8893,771 @@
           </wp:anchor>
         </w:drawing>
       </w:r>
-      <w:bookmarkEnd w:id="30"/>
+      <w:bookmarkEnd w:id="33"/>
+      <w:bookmarkEnd w:id="34"/>
       <w:r>
         <w:br w:type="page"/>
       </w:r>
     </w:p>
     <w:p>
       <w:pPr>
+        <w:pStyle w:val="Cmsor2"/>
+      </w:pPr>
+      <w:bookmarkStart w:id="35" w:name="_Toc227916170"/>
+      <w:r>
+        <w:lastRenderedPageBreak/>
+        <w:t>Admin felület</w:t>
+      </w:r>
+      <w:bookmarkEnd w:id="35"/>
+    </w:p>
+    <w:p>
+      <w:pPr>
+        <w:ind w:firstLine="0"/>
+      </w:pPr>
+      <w:r>
+        <w:t xml:space="preserve">Az adminisztrációs felület a </w:t>
+      </w:r>
+      <w:r>
+        <w:rPr>
+          <w:b/>
+          <w:bCs/>
+        </w:rPr>
+        <w:t>ParKing</w:t>
+      </w:r>
+      <w:r>
+        <w:t xml:space="preserve"> rendszer egyik központi eleme, amely lehetővé teszi a rendszer működésének felügyeletét, a felhasználók kezelését, valamint a parkolóhelyekkel kapcsolatos adatok karbantartását.</w:t>
+      </w:r>
+    </w:p>
+    <w:p>
+      <w:pPr>
+        <w:ind w:firstLine="0"/>
+      </w:pPr>
+      <w:r>
+        <w:t>A</w:t>
+      </w:r>
+      <w:r>
+        <w:t xml:space="preserve">z admin felületet két különböző technológia felhasználásával valósítottuk meg: </w:t>
+      </w:r>
+      <w:r>
+        <w:rPr>
+          <w:b/>
+          <w:bCs/>
+        </w:rPr>
+        <w:t>WPF</w:t>
+      </w:r>
+      <w:r>
+        <w:t xml:space="preserve"> és </w:t>
+      </w:r>
+      <w:r>
+        <w:rPr>
+          <w:b/>
+          <w:bCs/>
+        </w:rPr>
+        <w:t>Electron</w:t>
+      </w:r>
+      <w:r>
+        <w:t xml:space="preserve"> alapokon.</w:t>
+      </w:r>
+    </w:p>
+    <w:p>
+      <w:pPr>
+        <w:ind w:firstLine="0"/>
+      </w:pPr>
+      <w:r>
+        <w:rPr>
+          <w:b/>
+          <w:bCs/>
+        </w:rPr>
+        <w:t>WPF</w:t>
+      </w:r>
+      <w:r>
+        <w:t>:</w:t>
+      </w:r>
+      <w:r>
+        <w:t xml:space="preserve"> </w:t>
+      </w:r>
+      <w:r>
+        <w:t>A WPF (Windows Presentation Foundation) alapú alkalmazás egy klasszikus, asztali környezetben futó megoldás, amely elsősorban Windows operációs rendszerre készült. Előnye a magas teljesítmény, a natív működés, valamint a gazdag felhasználói felület kialakításának lehetősége.</w:t>
+      </w:r>
+      <w:r>
+        <w:t xml:space="preserve"> </w:t>
+      </w:r>
+      <w:r>
+        <w:t>A WPF segítségével egy stabil, gyors és jól strukturált adminisztrációs felületet hoztunk létre, amely ideális választás olyan környezetekben, ahol a rendszer használata dedikált számítógépen történik.</w:t>
+      </w:r>
+    </w:p>
+    <w:p>
+      <w:pPr>
+        <w:ind w:firstLine="0"/>
+      </w:pPr>
+      <w:r>
+        <w:t>A felületen az adatok a következőféleképpen jelennek meg:</w:t>
+      </w:r>
+    </w:p>
+    <w:p>
+      <w:pPr>
+        <w:ind w:firstLine="0"/>
+      </w:pPr>
+      <w:r>
+        <w:drawing>
+          <wp:inline distT="0" distB="0" distL="0" distR="0" wp14:anchorId="23F8E3EA" wp14:editId="534021DD">
+            <wp:extent cx="5579745" cy="2922270"/>
+            <wp:effectExtent l="0" t="0" r="1905" b="0"/>
+            <wp:docPr id="14" name="Kép 4">
+              <a:extLst xmlns:a="http://schemas.openxmlformats.org/drawingml/2006/main">
+                <a:ext uri="{FF2B5EF4-FFF2-40B4-BE49-F238E27FC236}">
+                  <a16:creationId xmlns:a16="http://schemas.microsoft.com/office/drawing/2014/main" id="{4A1777A0-FC69-486B-BF14-AC5E4CC29A95}"/>
+                </a:ext>
+              </a:extLst>
+            </wp:docPr>
+            <wp:cNvGraphicFramePr>
+              <a:graphicFrameLocks xmlns:a="http://schemas.openxmlformats.org/drawingml/2006/main" noChangeAspect="1"/>
+            </wp:cNvGraphicFramePr>
+            <a:graphic xmlns:a="http://schemas.openxmlformats.org/drawingml/2006/main">
+              <a:graphicData uri="http://schemas.openxmlformats.org/drawingml/2006/picture">
+                <pic:pic xmlns:pic="http://schemas.openxmlformats.org/drawingml/2006/picture">
+                  <pic:nvPicPr>
+                    <pic:cNvPr id="5" name="Kép 4">
+                      <a:extLst>
+                        <a:ext uri="{FF2B5EF4-FFF2-40B4-BE49-F238E27FC236}">
+                          <a16:creationId xmlns:a16="http://schemas.microsoft.com/office/drawing/2014/main" id="{4A1777A0-FC69-486B-BF14-AC5E4CC29A95}"/>
+                        </a:ext>
+                      </a:extLst>
+                    </pic:cNvPr>
+                    <pic:cNvPicPr>
+                      <a:picLocks noChangeAspect="1"/>
+                    </pic:cNvPicPr>
+                  </pic:nvPicPr>
+                  <pic:blipFill>
+                    <a:blip r:embed="rId34"/>
+                    <a:stretch>
+                      <a:fillRect/>
+                    </a:stretch>
+                  </pic:blipFill>
+                  <pic:spPr>
+                    <a:xfrm>
+                      <a:off x="0" y="0"/>
+                      <a:ext cx="5579745" cy="2922270"/>
+                    </a:xfrm>
+                    <a:prstGeom prst="rect">
+                      <a:avLst/>
+                    </a:prstGeom>
+                  </pic:spPr>
+                </pic:pic>
+              </a:graphicData>
+            </a:graphic>
+          </wp:inline>
+        </w:drawing>
+      </w:r>
+    </w:p>
+    <w:p>
+      <w:pPr>
+        <w:ind w:firstLine="0"/>
+      </w:pPr>
+      <w:r>
+        <w:t>A WPF alapú felületen a C# és az XAML programozási nyelveket használtuk.</w:t>
+      </w:r>
+    </w:p>
+    <w:p>
+      <w:pPr>
+        <w:ind w:firstLine="0"/>
+      </w:pPr>
+      <w:r>
+        <w:rPr>
+          <w:b/>
+          <w:bCs/>
+        </w:rPr>
+        <w:t>Electron</w:t>
+      </w:r>
+      <w:r>
+        <w:t>:</w:t>
+      </w:r>
+      <w:r>
+        <w:t xml:space="preserve"> </w:t>
+      </w:r>
+      <w:r>
+        <w:t>M</w:t>
+      </w:r>
+      <w:r>
+        <w:t>odern, webes technológiákra épül.</w:t>
+      </w:r>
+      <w:r>
+        <w:t xml:space="preserve"> L</w:t>
+      </w:r>
+      <w:r>
+        <w:t>ehetővé teszi, hogy a felület több operációs rendszeren (Windows, macOS, Linux) is futtatható legyen</w:t>
+      </w:r>
+      <w:r>
+        <w:t xml:space="preserve">. </w:t>
+      </w:r>
+      <w:r>
+        <w:t>Az alkalmazás felépítéséhez HTML-t és CSS-t használtunk a felhasználói felület kialakítására, míg a működéshez és az interaktív funkciók megvalósításához JavaScript szolgált alapul.</w:t>
+      </w:r>
+      <w:r>
+        <w:t xml:space="preserve"> </w:t>
+      </w:r>
+      <w:r>
+        <w:t>A</w:t>
+      </w:r>
+      <w:r>
+        <w:t>z Electron lehetőséget biztosít gyors frissítések kiadására és egyszerű telepítésre is, ami különösen előnyös a karbantartás és továbbfejlesztés szempontjából.</w:t>
+      </w:r>
+    </w:p>
+    <w:p>
+      <w:pPr>
+        <w:ind w:firstLine="0"/>
+      </w:pPr>
+      <w:r>
+        <w:lastRenderedPageBreak/>
+        <w:t>A felületen az adatok a következőféleképpen jelennek meg:</w:t>
+      </w:r>
+    </w:p>
+    <w:p>
+      <w:pPr>
+        <w:ind w:firstLine="0"/>
+      </w:pPr>
+      <w:r>
+        <w:drawing>
+          <wp:inline distT="0" distB="0" distL="0" distR="0" wp14:anchorId="69B3C36F" wp14:editId="256B9DC6">
+            <wp:extent cx="5579745" cy="3137535"/>
+            <wp:effectExtent l="0" t="0" r="1905" b="5715"/>
+            <wp:docPr id="15" name="Kép 6">
+              <a:extLst xmlns:a="http://schemas.openxmlformats.org/drawingml/2006/main">
+                <a:ext uri="{FF2B5EF4-FFF2-40B4-BE49-F238E27FC236}">
+                  <a16:creationId xmlns:a16="http://schemas.microsoft.com/office/drawing/2014/main" id="{BE4F1D5B-B2A9-45A0-916D-55D6B5F7D153}"/>
+                </a:ext>
+              </a:extLst>
+            </wp:docPr>
+            <wp:cNvGraphicFramePr>
+              <a:graphicFrameLocks xmlns:a="http://schemas.openxmlformats.org/drawingml/2006/main" noChangeAspect="1"/>
+            </wp:cNvGraphicFramePr>
+            <a:graphic xmlns:a="http://schemas.openxmlformats.org/drawingml/2006/main">
+              <a:graphicData uri="http://schemas.openxmlformats.org/drawingml/2006/picture">
+                <pic:pic xmlns:pic="http://schemas.openxmlformats.org/drawingml/2006/picture">
+                  <pic:nvPicPr>
+                    <pic:cNvPr id="7" name="Kép 6">
+                      <a:extLst>
+                        <a:ext uri="{FF2B5EF4-FFF2-40B4-BE49-F238E27FC236}">
+                          <a16:creationId xmlns:a16="http://schemas.microsoft.com/office/drawing/2014/main" id="{BE4F1D5B-B2A9-45A0-916D-55D6B5F7D153}"/>
+                        </a:ext>
+                      </a:extLst>
+                    </pic:cNvPr>
+                    <pic:cNvPicPr>
+                      <a:picLocks noChangeAspect="1"/>
+                    </pic:cNvPicPr>
+                  </pic:nvPicPr>
+                  <pic:blipFill>
+                    <a:blip r:embed="rId35"/>
+                    <a:stretch>
+                      <a:fillRect/>
+                    </a:stretch>
+                  </pic:blipFill>
+                  <pic:spPr>
+                    <a:xfrm>
+                      <a:off x="0" y="0"/>
+                      <a:ext cx="5579745" cy="3137535"/>
+                    </a:xfrm>
+                    <a:prstGeom prst="rect">
+                      <a:avLst/>
+                    </a:prstGeom>
+                  </pic:spPr>
+                </pic:pic>
+              </a:graphicData>
+            </a:graphic>
+          </wp:inline>
+        </w:drawing>
+      </w:r>
+    </w:p>
+    <w:p>
+      <w:pPr>
+        <w:ind w:firstLine="0"/>
+      </w:pPr>
+      <w:r>
+        <w:drawing>
+          <wp:anchor distT="0" distB="0" distL="114300" distR="114300" simplePos="0" relativeHeight="251721728" behindDoc="0" locked="0" layoutInCell="1" allowOverlap="1" wp14:anchorId="2CFEC4B2" wp14:editId="2002E6D6">
+            <wp:simplePos x="0" y="0"/>
+            <wp:positionH relativeFrom="margin">
+              <wp:align>center</wp:align>
+            </wp:positionH>
+            <wp:positionV relativeFrom="paragraph">
+              <wp:posOffset>2295101</wp:posOffset>
+            </wp:positionV>
+            <wp:extent cx="4888800" cy="1825200"/>
+            <wp:effectExtent l="38100" t="38100" r="45720" b="41910"/>
+            <wp:wrapTopAndBottom/>
+            <wp:docPr id="40" name="Kép 8">
+              <a:extLst xmlns:a="http://schemas.openxmlformats.org/drawingml/2006/main">
+                <a:ext uri="{FF2B5EF4-FFF2-40B4-BE49-F238E27FC236}">
+                  <a16:creationId xmlns:a16="http://schemas.microsoft.com/office/drawing/2014/main" id="{2C86A7D6-B69A-4181-9FE5-587BA4E0FAF7}"/>
+                </a:ext>
+              </a:extLst>
+            </wp:docPr>
+            <wp:cNvGraphicFramePr>
+              <a:graphicFrameLocks xmlns:a="http://schemas.openxmlformats.org/drawingml/2006/main" noChangeAspect="1"/>
+            </wp:cNvGraphicFramePr>
+            <a:graphic xmlns:a="http://schemas.openxmlformats.org/drawingml/2006/main">
+              <a:graphicData uri="http://schemas.openxmlformats.org/drawingml/2006/picture">
+                <pic:pic xmlns:pic="http://schemas.openxmlformats.org/drawingml/2006/picture">
+                  <pic:nvPicPr>
+                    <pic:cNvPr id="9" name="Kép 8">
+                      <a:extLst>
+                        <a:ext uri="{FF2B5EF4-FFF2-40B4-BE49-F238E27FC236}">
+                          <a16:creationId xmlns:a16="http://schemas.microsoft.com/office/drawing/2014/main" id="{2C86A7D6-B69A-4181-9FE5-587BA4E0FAF7}"/>
+                        </a:ext>
+                      </a:extLst>
+                    </pic:cNvPr>
+                    <pic:cNvPicPr>
+                      <a:picLocks noChangeAspect="1"/>
+                    </pic:cNvPicPr>
+                  </pic:nvPicPr>
+                  <pic:blipFill>
+                    <a:blip r:embed="rId36" cstate="print">
+                      <a:extLst>
+                        <a:ext uri="{28A0092B-C50C-407E-A947-70E740481C1C}">
+                          <a14:useLocalDpi xmlns:a14="http://schemas.microsoft.com/office/drawing/2010/main" val="0"/>
+                        </a:ext>
+                      </a:extLst>
+                    </a:blip>
+                    <a:stretch>
+                      <a:fillRect/>
+                    </a:stretch>
+                  </pic:blipFill>
+                  <pic:spPr>
+                    <a:xfrm>
+                      <a:off x="0" y="0"/>
+                      <a:ext cx="4888800" cy="1825200"/>
+                    </a:xfrm>
+                    <a:prstGeom prst="rect">
+                      <a:avLst/>
+                    </a:prstGeom>
+                    <a:ln w="25400">
+                      <a:solidFill>
+                        <a:schemeClr val="accent1"/>
+                      </a:solidFill>
+                    </a:ln>
+                  </pic:spPr>
+                </pic:pic>
+              </a:graphicData>
+            </a:graphic>
+            <wp14:sizeRelH relativeFrom="margin">
+              <wp14:pctWidth>0</wp14:pctWidth>
+            </wp14:sizeRelH>
+            <wp14:sizeRelV relativeFrom="margin">
+              <wp14:pctHeight>0</wp14:pctHeight>
+            </wp14:sizeRelV>
+          </wp:anchor>
+        </w:drawing>
+      </w:r>
+      <w:r>
+        <w:drawing>
+          <wp:anchor distT="0" distB="0" distL="114300" distR="114300" simplePos="0" relativeHeight="251720704" behindDoc="0" locked="0" layoutInCell="1" allowOverlap="1" wp14:anchorId="7DB81FEE" wp14:editId="4F2BEBB0">
+            <wp:simplePos x="0" y="0"/>
+            <wp:positionH relativeFrom="margin">
+              <wp:align>center</wp:align>
+            </wp:positionH>
+            <wp:positionV relativeFrom="paragraph">
+              <wp:posOffset>295998</wp:posOffset>
+            </wp:positionV>
+            <wp:extent cx="5164455" cy="1835785"/>
+            <wp:effectExtent l="38100" t="38100" r="36195" b="31115"/>
+            <wp:wrapTopAndBottom/>
+            <wp:docPr id="35" name="Kép 6">
+              <a:extLst xmlns:a="http://schemas.openxmlformats.org/drawingml/2006/main">
+                <a:ext uri="{FF2B5EF4-FFF2-40B4-BE49-F238E27FC236}">
+                  <a16:creationId xmlns:a16="http://schemas.microsoft.com/office/drawing/2014/main" id="{776CCC18-7416-4605-8767-30303A4259E3}"/>
+                </a:ext>
+              </a:extLst>
+            </wp:docPr>
+            <wp:cNvGraphicFramePr>
+              <a:graphicFrameLocks xmlns:a="http://schemas.openxmlformats.org/drawingml/2006/main" noChangeAspect="1"/>
+            </wp:cNvGraphicFramePr>
+            <a:graphic xmlns:a="http://schemas.openxmlformats.org/drawingml/2006/main">
+              <a:graphicData uri="http://schemas.openxmlformats.org/drawingml/2006/picture">
+                <pic:pic xmlns:pic="http://schemas.openxmlformats.org/drawingml/2006/picture">
+                  <pic:nvPicPr>
+                    <pic:cNvPr id="7" name="Kép 6">
+                      <a:extLst>
+                        <a:ext uri="{FF2B5EF4-FFF2-40B4-BE49-F238E27FC236}">
+                          <a16:creationId xmlns:a16="http://schemas.microsoft.com/office/drawing/2014/main" id="{776CCC18-7416-4605-8767-30303A4259E3}"/>
+                        </a:ext>
+                      </a:extLst>
+                    </pic:cNvPr>
+                    <pic:cNvPicPr>
+                      <a:picLocks noChangeAspect="1"/>
+                    </pic:cNvPicPr>
+                  </pic:nvPicPr>
+                  <pic:blipFill>
+                    <a:blip r:embed="rId37" cstate="print">
+                      <a:extLst>
+                        <a:ext uri="{28A0092B-C50C-407E-A947-70E740481C1C}">
+                          <a14:useLocalDpi xmlns:a14="http://schemas.microsoft.com/office/drawing/2010/main" val="0"/>
+                        </a:ext>
+                      </a:extLst>
+                    </a:blip>
+                    <a:stretch>
+                      <a:fillRect/>
+                    </a:stretch>
+                  </pic:blipFill>
+                  <pic:spPr>
+                    <a:xfrm>
+                      <a:off x="0" y="0"/>
+                      <a:ext cx="5164455" cy="1835785"/>
+                    </a:xfrm>
+                    <a:prstGeom prst="rect">
+                      <a:avLst/>
+                    </a:prstGeom>
+                    <a:ln w="25400">
+                      <a:solidFill>
+                        <a:schemeClr val="accent1"/>
+                      </a:solidFill>
+                    </a:ln>
+                  </pic:spPr>
+                </pic:pic>
+              </a:graphicData>
+            </a:graphic>
+            <wp14:sizeRelH relativeFrom="margin">
+              <wp14:pctWidth>0</wp14:pctWidth>
+            </wp14:sizeRelH>
+            <wp14:sizeRelV relativeFrom="margin">
+              <wp14:pctHeight>0</wp14:pctHeight>
+            </wp14:sizeRelV>
+          </wp:anchor>
+        </w:drawing>
+      </w:r>
+      <w:r>
+        <w:t>A kezdőlapon a következő</w:t>
+      </w:r>
+      <w:r>
+        <w:t xml:space="preserve"> statisztikák is megjelennek:</w:t>
+      </w:r>
+    </w:p>
+    <w:p>
+      <w:pPr>
+        <w:ind w:firstLine="0"/>
+      </w:pPr>
+      <w:r>
+        <w:rPr>
+          <w:noProof/>
+        </w:rPr>
+        <w:lastRenderedPageBreak/>
+        <w:drawing>
+          <wp:inline distT="0" distB="0" distL="0" distR="0" wp14:anchorId="05E27A68" wp14:editId="686797FB">
+            <wp:extent cx="5579745" cy="1966595"/>
+            <wp:effectExtent l="38100" t="38100" r="40005" b="33655"/>
+            <wp:docPr id="48" name="Kép 10">
+              <a:extLst xmlns:a="http://schemas.openxmlformats.org/drawingml/2006/main">
+                <a:ext uri="{FF2B5EF4-FFF2-40B4-BE49-F238E27FC236}">
+                  <a16:creationId xmlns:a16="http://schemas.microsoft.com/office/drawing/2014/main" id="{47137742-FBA2-41D3-ADD8-C56E0EDFC29F}"/>
+                </a:ext>
+              </a:extLst>
+            </wp:docPr>
+            <wp:cNvGraphicFramePr>
+              <a:graphicFrameLocks xmlns:a="http://schemas.openxmlformats.org/drawingml/2006/main" noChangeAspect="1"/>
+            </wp:cNvGraphicFramePr>
+            <a:graphic xmlns:a="http://schemas.openxmlformats.org/drawingml/2006/main">
+              <a:graphicData uri="http://schemas.openxmlformats.org/drawingml/2006/picture">
+                <pic:pic xmlns:pic="http://schemas.openxmlformats.org/drawingml/2006/picture">
+                  <pic:nvPicPr>
+                    <pic:cNvPr id="11" name="Kép 10">
+                      <a:extLst>
+                        <a:ext uri="{FF2B5EF4-FFF2-40B4-BE49-F238E27FC236}">
+                          <a16:creationId xmlns:a16="http://schemas.microsoft.com/office/drawing/2014/main" id="{47137742-FBA2-41D3-ADD8-C56E0EDFC29F}"/>
+                        </a:ext>
+                      </a:extLst>
+                    </pic:cNvPr>
+                    <pic:cNvPicPr>
+                      <a:picLocks noChangeAspect="1"/>
+                    </pic:cNvPicPr>
+                  </pic:nvPicPr>
+                  <pic:blipFill>
+                    <a:blip r:embed="rId38"/>
+                    <a:stretch>
+                      <a:fillRect/>
+                    </a:stretch>
+                  </pic:blipFill>
+                  <pic:spPr>
+                    <a:xfrm>
+                      <a:off x="0" y="0"/>
+                      <a:ext cx="5579745" cy="1966595"/>
+                    </a:xfrm>
+                    <a:prstGeom prst="rect">
+                      <a:avLst/>
+                    </a:prstGeom>
+                    <a:ln w="25400">
+                      <a:solidFill>
+                        <a:schemeClr val="accent1"/>
+                      </a:solidFill>
+                    </a:ln>
+                  </pic:spPr>
+                </pic:pic>
+              </a:graphicData>
+            </a:graphic>
+          </wp:inline>
+        </w:drawing>
+      </w:r>
+    </w:p>
+    <w:p>
+      <w:pPr>
+        <w:ind w:firstLine="0"/>
+      </w:pPr>
+      <w:r>
+        <w:rPr>
+          <w:noProof/>
+        </w:rPr>
+        <w:drawing>
+          <wp:anchor distT="0" distB="0" distL="114300" distR="114300" simplePos="0" relativeHeight="251719680" behindDoc="0" locked="0" layoutInCell="1" allowOverlap="1" wp14:anchorId="32F3C629" wp14:editId="0EFE0862">
+            <wp:simplePos x="0" y="0"/>
+            <wp:positionH relativeFrom="margin">
+              <wp:align>center</wp:align>
+            </wp:positionH>
+            <wp:positionV relativeFrom="paragraph">
+              <wp:posOffset>39542</wp:posOffset>
+            </wp:positionV>
+            <wp:extent cx="3209290" cy="3309620"/>
+            <wp:effectExtent l="38100" t="38100" r="29210" b="43180"/>
+            <wp:wrapTopAndBottom/>
+            <wp:docPr id="49" name="Kép 12">
+              <a:extLst xmlns:a="http://schemas.openxmlformats.org/drawingml/2006/main">
+                <a:ext uri="{FF2B5EF4-FFF2-40B4-BE49-F238E27FC236}">
+                  <a16:creationId xmlns:a16="http://schemas.microsoft.com/office/drawing/2014/main" id="{AB3D7335-80DA-4F4A-A484-C8530A9744FA}"/>
+                </a:ext>
+              </a:extLst>
+            </wp:docPr>
+            <wp:cNvGraphicFramePr>
+              <a:graphicFrameLocks xmlns:a="http://schemas.openxmlformats.org/drawingml/2006/main" noChangeAspect="1"/>
+            </wp:cNvGraphicFramePr>
+            <a:graphic xmlns:a="http://schemas.openxmlformats.org/drawingml/2006/main">
+              <a:graphicData uri="http://schemas.openxmlformats.org/drawingml/2006/picture">
+                <pic:pic xmlns:pic="http://schemas.openxmlformats.org/drawingml/2006/picture">
+                  <pic:nvPicPr>
+                    <pic:cNvPr id="13" name="Kép 12">
+                      <a:extLst>
+                        <a:ext uri="{FF2B5EF4-FFF2-40B4-BE49-F238E27FC236}">
+                          <a16:creationId xmlns:a16="http://schemas.microsoft.com/office/drawing/2014/main" id="{AB3D7335-80DA-4F4A-A484-C8530A9744FA}"/>
+                        </a:ext>
+                      </a:extLst>
+                    </pic:cNvPr>
+                    <pic:cNvPicPr>
+                      <a:picLocks noChangeAspect="1"/>
+                    </pic:cNvPicPr>
+                  </pic:nvPicPr>
+                  <pic:blipFill>
+                    <a:blip r:embed="rId39">
+                      <a:extLst>
+                        <a:ext uri="{28A0092B-C50C-407E-A947-70E740481C1C}">
+                          <a14:useLocalDpi xmlns:a14="http://schemas.microsoft.com/office/drawing/2010/main" val="0"/>
+                        </a:ext>
+                      </a:extLst>
+                    </a:blip>
+                    <a:stretch>
+                      <a:fillRect/>
+                    </a:stretch>
+                  </pic:blipFill>
+                  <pic:spPr>
+                    <a:xfrm>
+                      <a:off x="0" y="0"/>
+                      <a:ext cx="3209290" cy="3309620"/>
+                    </a:xfrm>
+                    <a:prstGeom prst="rect">
+                      <a:avLst/>
+                    </a:prstGeom>
+                    <a:ln w="25400">
+                      <a:solidFill>
+                        <a:schemeClr val="accent1"/>
+                      </a:solidFill>
+                    </a:ln>
+                  </pic:spPr>
+                </pic:pic>
+              </a:graphicData>
+            </a:graphic>
+          </wp:anchor>
+        </w:drawing>
+      </w:r>
+      <w:r>
+        <w:rPr>
+          <w:noProof/>
+        </w:rPr>
+        <w:t xml:space="preserve">  </w:t>
+      </w:r>
+    </w:p>
+    <w:p>
+      <w:pPr>
+        <w:ind w:firstLine="0"/>
+      </w:pPr>
+      <w:r>
+        <w:t>A lista oszlopokba rendezve jeleníti meg a felhasználók adatait, mint például az azonosító (ID), név, e-mail cím, telefonszám, jelszó (titkosított formában), valamint a regisztráció dátuma</w:t>
+      </w:r>
+      <w:r>
+        <w:t>:</w:t>
+      </w:r>
+      <w:r>
+        <w:drawing>
+          <wp:inline distT="0" distB="0" distL="0" distR="0" wp14:anchorId="081E256A" wp14:editId="3D952A22">
+            <wp:extent cx="5579745" cy="695960"/>
+            <wp:effectExtent l="0" t="0" r="1905" b="8890"/>
+            <wp:docPr id="16" name="Kép 4">
+              <a:extLst xmlns:a="http://schemas.openxmlformats.org/drawingml/2006/main">
+                <a:ext uri="{FF2B5EF4-FFF2-40B4-BE49-F238E27FC236}">
+                  <a16:creationId xmlns:a16="http://schemas.microsoft.com/office/drawing/2014/main" id="{1D31FA8D-3937-40FC-8C69-BF7FE62C37A2}"/>
+                </a:ext>
+              </a:extLst>
+            </wp:docPr>
+            <wp:cNvGraphicFramePr>
+              <a:graphicFrameLocks xmlns:a="http://schemas.openxmlformats.org/drawingml/2006/main" noChangeAspect="1"/>
+            </wp:cNvGraphicFramePr>
+            <a:graphic xmlns:a="http://schemas.openxmlformats.org/drawingml/2006/main">
+              <a:graphicData uri="http://schemas.openxmlformats.org/drawingml/2006/picture">
+                <pic:pic xmlns:pic="http://schemas.openxmlformats.org/drawingml/2006/picture">
+                  <pic:nvPicPr>
+                    <pic:cNvPr id="5" name="Kép 4">
+                      <a:extLst>
+                        <a:ext uri="{FF2B5EF4-FFF2-40B4-BE49-F238E27FC236}">
+                          <a16:creationId xmlns:a16="http://schemas.microsoft.com/office/drawing/2014/main" id="{1D31FA8D-3937-40FC-8C69-BF7FE62C37A2}"/>
+                        </a:ext>
+                      </a:extLst>
+                    </pic:cNvPr>
+                    <pic:cNvPicPr>
+                      <a:picLocks noChangeAspect="1"/>
+                    </pic:cNvPicPr>
+                  </pic:nvPicPr>
+                  <pic:blipFill>
+                    <a:blip r:embed="rId40"/>
+                    <a:stretch>
+                      <a:fillRect/>
+                    </a:stretch>
+                  </pic:blipFill>
+                  <pic:spPr>
+                    <a:xfrm>
+                      <a:off x="0" y="0"/>
+                      <a:ext cx="5579745" cy="695960"/>
+                    </a:xfrm>
+                    <a:prstGeom prst="rect">
+                      <a:avLst/>
+                    </a:prstGeom>
+                  </pic:spPr>
+                </pic:pic>
+              </a:graphicData>
+            </a:graphic>
+          </wp:inline>
+        </w:drawing>
+      </w:r>
+    </w:p>
+    <w:p>
+      <w:pPr>
+        <w:ind w:firstLine="0"/>
+      </w:pPr>
+      <w:r>
+        <w:t>A „Műveletek” oszlopban különböző ikonok segítségével lehetőség van a felhasználók adatainak szerkesztésére, illetve törlésére. A törlés ikonra kattintva egy megerősítő ablak jelenik meg, amely megakadályozza a véletlen adatvesztést, és rákérdez a művelet végrehajtására („Biztosan törli?”), ahol az „Igen” és „Mégsem” opciók közül választhatunk.</w:t>
+      </w:r>
+    </w:p>
+    <w:p>
+      <w:pPr>
+        <w:ind w:firstLine="0"/>
+      </w:pPr>
+      <w:r>
+        <w:lastRenderedPageBreak/>
+        <w:drawing>
+          <wp:anchor distT="0" distB="0" distL="114300" distR="114300" simplePos="0" relativeHeight="251718656" behindDoc="0" locked="0" layoutInCell="1" allowOverlap="1" wp14:anchorId="7AEF3003" wp14:editId="4A3B91F6">
+            <wp:simplePos x="0" y="0"/>
+            <wp:positionH relativeFrom="margin">
+              <wp:align>center</wp:align>
+            </wp:positionH>
+            <wp:positionV relativeFrom="paragraph">
+              <wp:posOffset>1255283</wp:posOffset>
+            </wp:positionV>
+            <wp:extent cx="4594225" cy="4477385"/>
+            <wp:effectExtent l="0" t="0" r="0" b="0"/>
+            <wp:wrapTopAndBottom/>
+            <wp:docPr id="21" name="Kép 6">
+              <a:extLst xmlns:a="http://schemas.openxmlformats.org/drawingml/2006/main">
+                <a:ext uri="{FF2B5EF4-FFF2-40B4-BE49-F238E27FC236}">
+                  <a16:creationId xmlns:a16="http://schemas.microsoft.com/office/drawing/2014/main" id="{0FEA8572-5238-4981-B8F8-E32A6D7A9461}"/>
+                </a:ext>
+              </a:extLst>
+            </wp:docPr>
+            <wp:cNvGraphicFramePr>
+              <a:graphicFrameLocks xmlns:a="http://schemas.openxmlformats.org/drawingml/2006/main" noChangeAspect="1"/>
+            </wp:cNvGraphicFramePr>
+            <a:graphic xmlns:a="http://schemas.openxmlformats.org/drawingml/2006/main">
+              <a:graphicData uri="http://schemas.openxmlformats.org/drawingml/2006/picture">
+                <pic:pic xmlns:pic="http://schemas.openxmlformats.org/drawingml/2006/picture">
+                  <pic:nvPicPr>
+                    <pic:cNvPr id="7" name="Kép 6">
+                      <a:extLst>
+                        <a:ext uri="{FF2B5EF4-FFF2-40B4-BE49-F238E27FC236}">
+                          <a16:creationId xmlns:a16="http://schemas.microsoft.com/office/drawing/2014/main" id="{0FEA8572-5238-4981-B8F8-E32A6D7A9461}"/>
+                        </a:ext>
+                      </a:extLst>
+                    </pic:cNvPr>
+                    <pic:cNvPicPr>
+                      <a:picLocks noChangeAspect="1"/>
+                    </pic:cNvPicPr>
+                  </pic:nvPicPr>
+                  <pic:blipFill rotWithShape="1">
+                    <a:blip r:embed="rId41">
+                      <a:extLst>
+                        <a:ext uri="{28A0092B-C50C-407E-A947-70E740481C1C}">
+                          <a14:useLocalDpi xmlns:a14="http://schemas.microsoft.com/office/drawing/2010/main" val="0"/>
+                        </a:ext>
+                      </a:extLst>
+                    </a:blip>
+                    <a:srcRect l="792" t="357"/>
+                    <a:stretch/>
+                  </pic:blipFill>
+                  <pic:spPr>
+                    <a:xfrm>
+                      <a:off x="0" y="0"/>
+                      <a:ext cx="4594225" cy="4477385"/>
+                    </a:xfrm>
+                    <a:prstGeom prst="rect">
+                      <a:avLst/>
+                    </a:prstGeom>
+                  </pic:spPr>
+                </pic:pic>
+              </a:graphicData>
+            </a:graphic>
+            <wp14:sizeRelH relativeFrom="margin">
+              <wp14:pctWidth>0</wp14:pctWidth>
+            </wp14:sizeRelH>
+            <wp14:sizeRelV relativeFrom="margin">
+              <wp14:pctHeight>0</wp14:pctHeight>
+            </wp14:sizeRelV>
+          </wp:anchor>
+        </w:drawing>
+      </w:r>
+      <w:r>
+        <w:t>A „Foglalás szerkesztése” panelen az adminisztrátor módosíthatja a kiválasztott foglalás adatait, például a rendszámot, az emelet számát és a parkolóhely azonosítóját. Emellett lehetőség van a foglalás kezdő- és végdátumának beállítására is, amelyet dátumválasztó segítségével lehet megadni</w:t>
+      </w:r>
+      <w:r>
+        <w:t>:</w:t>
+      </w:r>
+    </w:p>
+    <w:p>
+      <w:pPr>
+        <w:spacing w:line="259" w:lineRule="auto"/>
+        <w:ind w:firstLine="0"/>
+        <w:jc w:val="left"/>
+        <w:rPr>
+          <w:rFonts w:eastAsiaTheme="majorEastAsia" w:cstheme="majorBidi"/>
+          <w:b/>
+          <w:sz w:val="32"/>
+          <w:szCs w:val="32"/>
+        </w:rPr>
+      </w:pPr>
+      <w:r>
+        <w:br w:type="page"/>
+      </w:r>
+    </w:p>
+    <w:p>
+      <w:pPr>
         <w:pStyle w:val="Cmsor1"/>
       </w:pPr>
-      <w:bookmarkStart w:id="31" w:name="_Toc227745024"/>
+      <w:bookmarkStart w:id="36" w:name="_Toc227916171"/>
       <w:r>
         <w:lastRenderedPageBreak/>
         <w:t>Fejlesztési lehetőségek</w:t>
       </w:r>
-      <w:bookmarkEnd w:id="31"/>
+      <w:bookmarkEnd w:id="36"/>
     </w:p>
     <w:p>
       <w:pPr>
@@ -9145,12 +9960,12 @@
       <w:pPr>
         <w:pStyle w:val="Cmsor1"/>
       </w:pPr>
-      <w:bookmarkStart w:id="32" w:name="_Toc227745025"/>
+      <w:bookmarkStart w:id="37" w:name="_Toc227916172"/>
       <w:r>
         <w:lastRenderedPageBreak/>
         <w:t>Tesztelés</w:t>
       </w:r>
-      <w:bookmarkEnd w:id="32"/>
+      <w:bookmarkEnd w:id="37"/>
     </w:p>
     <w:p>
       <w:pPr>
@@ -9177,17 +9992,8 @@
         <w:t>backend API</w:t>
       </w:r>
       <w:r>
-        <w:t>-</w:t>
-      </w:r>
-      <w:proofErr w:type="spellStart"/>
-      <w:r>
-        <w:t>jának</w:t>
-      </w:r>
-      <w:proofErr w:type="spellEnd"/>
-      <w:r>
-        <w:t xml:space="preserve"> automatizált tesztelését valósítja meg </w:t>
-      </w:r>
-      <w:proofErr w:type="spellStart"/>
+        <w:t xml:space="preserve">-jának automatizált tesztelését valósítja meg </w:t>
+      </w:r>
       <w:r>
         <w:rPr>
           <w:b/>
@@ -9195,11 +10001,9 @@
         </w:rPr>
         <w:t>Jest</w:t>
       </w:r>
-      <w:proofErr w:type="spellEnd"/>
       <w:r>
         <w:t xml:space="preserve"> és </w:t>
       </w:r>
-      <w:proofErr w:type="spellStart"/>
       <w:r>
         <w:rPr>
           <w:b/>
@@ -9207,7 +10011,6 @@
         </w:rPr>
         <w:t>Supertest</w:t>
       </w:r>
-      <w:proofErr w:type="spellEnd"/>
       <w:r>
         <w:t xml:space="preserve"> segítségével. A célja annak ellenőrzése, hogy a felhasználói regisztrációval és bejelentkezéssel kapcsolatos végpontok megfelelően működnek, valamint a legfontosabb </w:t>
       </w:r>
@@ -9227,20 +10030,11 @@
         <w:ind w:firstLine="0"/>
       </w:pPr>
       <w:r>
-        <w:t xml:space="preserve">A tesztkód a </w:t>
-      </w:r>
-      <w:proofErr w:type="spellStart"/>
-      <w:r>
-        <w:t>supertest</w:t>
-      </w:r>
-      <w:proofErr w:type="spellEnd"/>
-      <w:r>
-        <w:t xml:space="preserve"> csomagot használja az Express alkalmazás HTTP végpontjainak szimulált hívására, így valódi szerverindítás nélkül tudjuk vizsgálni az API működését. A</w:t>
+        <w:t>A tesztkód a supertest csomagot használja az Express alkalmazás HTTP végpontjainak szimulált hívására, így valódi szerverindítás nélkül tudjuk vizsgálni az API működését. A</w:t>
       </w:r>
       <w:r>
         <w:t xml:space="preserve"> </w:t>
       </w:r>
-      <w:proofErr w:type="spellStart"/>
       <w:r>
         <w:rPr>
           <w:b/>
@@ -9248,14 +10042,12 @@
         </w:rPr>
         <w:t>jestmock</w:t>
       </w:r>
-      <w:proofErr w:type="spellEnd"/>
       <w:r>
         <w:t xml:space="preserve"> </w:t>
       </w:r>
       <w:r>
         <w:t>segítségével a felhasználói adatbázis-modell (</w:t>
       </w:r>
-      <w:proofErr w:type="spellStart"/>
       <w:r>
         <w:rPr>
           <w:b/>
@@ -9263,11 +10055,9 @@
         </w:rPr>
         <w:t>mainModel</w:t>
       </w:r>
-      <w:proofErr w:type="spellEnd"/>
       <w:r>
         <w:t xml:space="preserve">) és a </w:t>
       </w:r>
-      <w:proofErr w:type="spellStart"/>
       <w:r>
         <w:rPr>
           <w:b/>
@@ -9275,17 +10065,8 @@
         </w:rPr>
         <w:t>bcrypt</w:t>
       </w:r>
-      <w:proofErr w:type="spellEnd"/>
-      <w:r>
-        <w:t xml:space="preserve"> jelszókezelő könyvtár működése ki van </w:t>
-      </w:r>
-      <w:proofErr w:type="spellStart"/>
-      <w:r>
-        <w:t>mockolva</w:t>
-      </w:r>
-      <w:proofErr w:type="spellEnd"/>
-      <w:r>
-        <w:t>, vagyis nem történik valódi adatbázis-művelet. Ez gyorsabbá, megbízhatóbbá teszi a tesztelést.</w:t>
+      <w:r>
+        <w:t xml:space="preserve"> jelszókezelő könyvtár működése ki van mockolva, vagyis nem történik valódi adatbázis-művelet. Ez gyorsabbá, megbízhatóbbá teszi a tesztelést.</w:t>
       </w:r>
     </w:p>
     <w:p>
@@ -9305,15 +10086,7 @@
         </w:numPr>
       </w:pPr>
       <w:r>
-        <w:t>Regisztráció (POST /users/</w:t>
-      </w:r>
-      <w:proofErr w:type="spellStart"/>
-      <w:r>
-        <w:t>register</w:t>
-      </w:r>
-      <w:proofErr w:type="spellEnd"/>
-      <w:r>
-        <w:t>)</w:t>
+        <w:t>Regisztráció (POST /users/register)</w:t>
       </w:r>
     </w:p>
     <w:p>
@@ -9445,15 +10218,7 @@
         </w:numPr>
       </w:pPr>
       <w:r>
-        <w:t>Regisztrációs oldal (/</w:t>
-      </w:r>
-      <w:proofErr w:type="spellStart"/>
-      <w:r>
-        <w:t>register</w:t>
-      </w:r>
-      <w:proofErr w:type="spellEnd"/>
-      <w:r>
-        <w:t>)</w:t>
+        <w:t>Regisztrációs oldal (/register)</w:t>
       </w:r>
     </w:p>
     <w:p>
@@ -9497,7 +10262,7 @@
                     <pic:cNvPicPr/>
                   </pic:nvPicPr>
                   <pic:blipFill>
-                    <a:blip r:embed="rId34">
+                    <a:blip r:embed="rId42">
                       <a:extLst>
                         <a:ext uri="{28A0092B-C50C-407E-A947-70E740481C1C}">
                           <a14:useLocalDpi xmlns:a14="http://schemas.microsoft.com/office/drawing/2010/main" val="0"/>
@@ -9600,7 +10365,7 @@
                     <pic:cNvPicPr/>
                   </pic:nvPicPr>
                   <pic:blipFill>
-                    <a:blip r:embed="rId35">
+                    <a:blip r:embed="rId43">
                       <a:extLst>
                         <a:ext uri="{28A0092B-C50C-407E-A947-70E740481C1C}">
                           <a14:useLocalDpi xmlns:a14="http://schemas.microsoft.com/office/drawing/2010/main" val="0"/>
@@ -9640,12 +10405,12 @@
       <w:pPr>
         <w:pStyle w:val="Cmsor1"/>
       </w:pPr>
-      <w:bookmarkStart w:id="33" w:name="_Toc227745026"/>
+      <w:bookmarkStart w:id="38" w:name="_Toc227916173"/>
       <w:r>
         <w:lastRenderedPageBreak/>
         <w:t>Projektmenedzsment</w:t>
       </w:r>
-      <w:bookmarkEnd w:id="33"/>
+      <w:bookmarkEnd w:id="38"/>
     </w:p>
     <w:p>
       <w:pPr>
@@ -9654,31 +10419,21 @@
           <w:rStyle w:val="Cmsor2Char"/>
         </w:rPr>
       </w:pPr>
-      <w:bookmarkStart w:id="34" w:name="_Toc227745027"/>
-      <w:proofErr w:type="spellStart"/>
+      <w:bookmarkStart w:id="39" w:name="_Toc227916174"/>
       <w:r>
         <w:rPr>
           <w:rStyle w:val="Cmsor2Char"/>
         </w:rPr>
         <w:t>Jira</w:t>
       </w:r>
-      <w:bookmarkEnd w:id="34"/>
-      <w:proofErr w:type="spellEnd"/>
+      <w:bookmarkEnd w:id="39"/>
     </w:p>
     <w:p>
       <w:pPr>
         <w:ind w:firstLine="0"/>
       </w:pPr>
       <w:r>
-        <w:t xml:space="preserve">A </w:t>
-      </w:r>
-      <w:proofErr w:type="spellStart"/>
-      <w:r>
-        <w:t>Jira</w:t>
-      </w:r>
-      <w:proofErr w:type="spellEnd"/>
-      <w:r>
-        <w:t xml:space="preserve"> egy széles körben használt projektmenedzsment és hibakövető rendszer. Lehetővé teszi a feladatok, hibák és fejlesztési igények nyomon követését, priorizálását és státusz szerinti kezelését.</w:t>
+        <w:t>A Jira egy széles körben használt projektmenedzsment és hibakövető rendszer. Lehetővé teszi a feladatok, hibák és fejlesztési igények nyomon követését, priorizálását és státusz szerinti kezelését.</w:t>
       </w:r>
     </w:p>
     <w:p>
@@ -9713,7 +10468,7 @@
                     <pic:cNvPicPr/>
                   </pic:nvPicPr>
                   <pic:blipFill>
-                    <a:blip r:embed="rId36" cstate="print">
+                    <a:blip r:embed="rId44" cstate="print">
                       <a:extLst>
                         <a:ext uri="{28A0092B-C50C-407E-A947-70E740481C1C}">
                           <a14:useLocalDpi xmlns:a14="http://schemas.microsoft.com/office/drawing/2010/main" val="0"/>
@@ -9746,15 +10501,7 @@
         </w:drawing>
       </w:r>
       <w:r>
-        <w:t xml:space="preserve">A projekt során a feladatokat ezen a felületen keresztül osztottuk el a csapattagok között. A </w:t>
-      </w:r>
-      <w:proofErr w:type="spellStart"/>
-      <w:r>
-        <w:t>Jira</w:t>
-      </w:r>
-      <w:proofErr w:type="spellEnd"/>
-      <w:r>
-        <w:t xml:space="preserve"> segítségével egyértelműen rögzítettük a felelősöket, határidőket és az aktuális állapotot, így mindenki átlátható módon követhette a saját és a közös munkafolyamatok előrehaladását.</w:t>
+        <w:t>A projekt során a feladatokat ezen a felületen keresztül osztottuk el a csapattagok között. A Jira segítségével egyértelműen rögzítettük a felelősöket, határidőket és az aktuális állapotot, így mindenki átlátható módon követhette a saját és a közös munkafolyamatok előrehaladását.</w:t>
       </w:r>
     </w:p>
     <w:p>
@@ -9799,7 +10546,7 @@
                     <pic:cNvPicPr/>
                   </pic:nvPicPr>
                   <pic:blipFill>
-                    <a:blip r:embed="rId37">
+                    <a:blip r:embed="rId45">
                       <a:extLst>
                         <a:ext uri="{28A0092B-C50C-407E-A947-70E740481C1C}">
                           <a14:useLocalDpi xmlns:a14="http://schemas.microsoft.com/office/drawing/2010/main" val="0"/>
@@ -9869,7 +10616,7 @@
                     <pic:cNvPicPr/>
                   </pic:nvPicPr>
                   <pic:blipFill>
-                    <a:blip r:embed="rId38" cstate="print">
+                    <a:blip r:embed="rId46" cstate="print">
                       <a:extLst>
                         <a:ext uri="{28A0092B-C50C-407E-A947-70E740481C1C}">
                           <a14:useLocalDpi xmlns:a14="http://schemas.microsoft.com/office/drawing/2010/main" val="0"/>
@@ -9909,16 +10656,11 @@
       <w:pPr>
         <w:pStyle w:val="Cmsor2"/>
       </w:pPr>
-      <w:bookmarkStart w:id="35" w:name="_Toc227745028"/>
-      <w:r>
-        <w:t xml:space="preserve">Git &amp; </w:t>
-      </w:r>
-      <w:proofErr w:type="spellStart"/>
-      <w:r>
-        <w:t>Github</w:t>
-      </w:r>
-      <w:bookmarkEnd w:id="35"/>
-      <w:proofErr w:type="spellEnd"/>
+      <w:bookmarkStart w:id="40" w:name="_Toc227916175"/>
+      <w:r>
+        <w:t>Git &amp; Github</w:t>
+      </w:r>
+      <w:bookmarkEnd w:id="40"/>
     </w:p>
     <w:p>
       <w:pPr>
@@ -10013,36 +10755,12 @@
         <w:t>GitHub</w:t>
       </w:r>
       <w:r>
-        <w:t xml:space="preserve"> felületén kezeltük a teljes forráskódot, itt hoztuk létre és egyesítettük a </w:t>
-      </w:r>
-      <w:proofErr w:type="spellStart"/>
-      <w:r>
-        <w:t>brancheket</w:t>
-      </w:r>
-      <w:proofErr w:type="spellEnd"/>
-      <w:r>
-        <w:t xml:space="preserve">, valamint </w:t>
-      </w:r>
-      <w:proofErr w:type="spellStart"/>
-      <w:r>
-        <w:t>pull</w:t>
-      </w:r>
-      <w:proofErr w:type="spellEnd"/>
-      <w:r>
-        <w:t xml:space="preserve"> </w:t>
-      </w:r>
-      <w:proofErr w:type="spellStart"/>
-      <w:r>
-        <w:t>requesteken</w:t>
-      </w:r>
-      <w:proofErr w:type="spellEnd"/>
-      <w:r>
-        <w:t xml:space="preserve"> keresztül végeztük a kódellenőrzést. A feladatokhoz kapcsolódó módosításokat itt dokumentáltuk, így a fejlesztési folyamat átlátható és visszakövethető maradt a csapat minden tagja számára.</w:t>
+        <w:t xml:space="preserve"> felületén kezeltük a teljes forráskódot, itt hoztuk létre és egyesítettük a brancheket, valamint pull requesteken keresztül végeztük a kódellenőrzést. A feladatokhoz kapcsolódó módosításokat itt dokumentáltuk, így a fejlesztési folyamat átlátható és visszakövethető maradt a csapat minden tagja számára.</w:t>
       </w:r>
     </w:p>
     <w:p/>
     <w:sectPr>
-      <w:footerReference w:type="default" r:id="rId39"/>
+      <w:footerReference w:type="default" r:id="rId47"/>
       <w:pgSz w:w="11906" w:h="16838"/>
       <w:pgMar w:top="1418" w:right="1418" w:bottom="1418" w:left="1701" w:header="709" w:footer="709" w:gutter="0"/>
       <w:cols w:space="708"/>
@@ -14199,7 +14917,6 @@
   <w:style w:type="character" w:default="1" w:styleId="Bekezdsalapbettpusa">
     <w:name w:val="Default Paragraph Font"/>
     <w:uiPriority w:val="1"/>
-    <w:semiHidden/>
     <w:unhideWhenUsed/>
   </w:style>
   <w:style w:type="table" w:default="1" w:styleId="Normltblzat">

</xml_diff>